<commit_message>
table1 and table 2 updated
</commit_message>
<xml_diff>
--- a/exports/table2.docx
+++ b/exports/table2.docx
@@ -41,6 +41,50 @@
               </w:rPr>
               <w:t xml:space="preserve">Characteristic</w:t>
             </w:r>
+          </w:p>
+        </w:tc>
+        <w:tc>
+          <w:tcPr>
+            <w:tcBorders>
+              <w:top w:val="single" w:sz="16" w:space="0" w:color="D3D3D3"/>
+              <w:bottom w:val="single" w:sz="16" w:space="0" w:color="D3D3D3"/>
+            </w:tcBorders>
+          </w:tcPr>
+          <w:p>
+            <w:pPr>
+              <w:spacing w:before="0" w:after="60"/>
+              <w:keepNext/>
+              <w:jc w:val="center"/>
+            </w:pPr>
+            <w:r>
+              <w:rPr>
+                <w:b w:val="true"/>
+                <w:rFonts w:ascii="Calibri" w:hAnsi="Calibri"/>
+                <w:sz w:val="20"/>
+              </w:rPr>
+              <w:t xml:space="preserve">2017</w:t>
+            </w:r>
+            <w:r>
+              <w:rPr>
+                <w:rFonts w:ascii="Calibri" w:hAnsi="Calibri"/>
+                <w:sz w:val="20"/>
+              </w:rPr>
+              <w:t xml:space="preserve"/>
+            </w:r>
+            <w:r xmlns:w="http://schemas.openxmlformats.org/wordprocessingml/2006/main">
+              <w:rPr>
+                <w:rFonts w:ascii="Calibri" w:hAnsi="Calibri"/>
+                <w:sz w:val="20"/>
+              </w:rPr>
+              <w:t xml:space="preserve"> </w:t>
+            </w:r>
+            <w:r>
+              <w:rPr>
+                <w:rFonts w:ascii="Calibri" w:hAnsi="Calibri"/>
+                <w:sz w:val="20"/>
+              </w:rPr>
+              <w:t xml:space="preserve">N = 8,550,082</w:t>
+            </w:r>
             <w:r>
               <w:rPr>
                 <w:vertAlign w:val="superscript"/>
@@ -71,7 +115,7 @@
                 <w:rFonts w:ascii="Calibri" w:hAnsi="Calibri"/>
                 <w:sz w:val="20"/>
               </w:rPr>
-              <w:t xml:space="preserve">2019</w:t>
+              <w:t xml:space="preserve">2018</w:t>
             </w:r>
             <w:r>
               <w:rPr>
@@ -92,7 +136,7 @@
                 <w:rFonts w:ascii="Calibri" w:hAnsi="Calibri"/>
                 <w:sz w:val="20"/>
               </w:rPr>
-              <w:t xml:space="preserve">N = 2,085,412</w:t>
+              <w:t xml:space="preserve">N = 8,498,121</w:t>
             </w:r>
             <w:r>
               <w:rPr>
@@ -101,7 +145,7 @@
                 <w:rFonts w:ascii="Calibri" w:hAnsi="Calibri"/>
                 <w:sz w:val="20"/>
               </w:rPr>
-              <w:t xml:space="default">2</w:t>
+              <w:t xml:space="default">1</w:t>
             </w:r>
           </w:p>
         </w:tc>
@@ -124,7 +168,7 @@
                 <w:rFonts w:ascii="Calibri" w:hAnsi="Calibri"/>
                 <w:sz w:val="20"/>
               </w:rPr>
-              <w:t xml:space="preserve">2021</w:t>
+              <w:t xml:space="preserve">2019</w:t>
             </w:r>
             <w:r>
               <w:rPr>
@@ -145,7 +189,7 @@
                 <w:rFonts w:ascii="Calibri" w:hAnsi="Calibri"/>
                 <w:sz w:val="20"/>
               </w:rPr>
-              <w:t xml:space="preserve">N = 2,137,037</w:t>
+              <w:t xml:space="preserve">N = 8,120,916</w:t>
             </w:r>
             <w:r>
               <w:rPr>
@@ -154,7 +198,7 @@
                 <w:rFonts w:ascii="Calibri" w:hAnsi="Calibri"/>
                 <w:sz w:val="20"/>
               </w:rPr>
-              <w:t xml:space="default">2</w:t>
+              <w:t xml:space="default">1</w:t>
             </w:r>
           </w:p>
         </w:tc>
@@ -163,7 +207,6 @@
             <w:tcBorders>
               <w:top w:val="single" w:sz="16" w:space="0" w:color="D3D3D3"/>
               <w:bottom w:val="single" w:sz="16" w:space="0" w:color="D3D3D3"/>
-              <w:end w:val="single" w:space="0" w:color="D3D3D3"/>
             </w:tcBorders>
           </w:tcPr>
           <w:p>
@@ -178,7 +221,28 @@
                 <w:rFonts w:ascii="Calibri" w:hAnsi="Calibri"/>
                 <w:sz w:val="20"/>
               </w:rPr>
-              <w:t xml:space="preserve">p-value</w:t>
+              <w:t xml:space="preserve">2020</w:t>
+            </w:r>
+            <w:r>
+              <w:rPr>
+                <w:rFonts w:ascii="Calibri" w:hAnsi="Calibri"/>
+                <w:sz w:val="20"/>
+              </w:rPr>
+              <w:t xml:space="preserve"/>
+            </w:r>
+            <w:r xmlns:w="http://schemas.openxmlformats.org/wordprocessingml/2006/main">
+              <w:rPr>
+                <w:rFonts w:ascii="Calibri" w:hAnsi="Calibri"/>
+                <w:sz w:val="20"/>
+              </w:rPr>
+              <w:t xml:space="preserve"> </w:t>
+            </w:r>
+            <w:r>
+              <w:rPr>
+                <w:rFonts w:ascii="Calibri" w:hAnsi="Calibri"/>
+                <w:sz w:val="20"/>
+              </w:rPr>
+              <w:t xml:space="preserve">N = 8,052,396</w:t>
             </w:r>
             <w:r>
               <w:rPr>
@@ -187,7 +251,199 @@
                 <w:rFonts w:ascii="Calibri" w:hAnsi="Calibri"/>
                 <w:sz w:val="20"/>
               </w:rPr>
-              <w:t xml:space="default">3</w:t>
+              <w:t xml:space="default">1</w:t>
+            </w:r>
+          </w:p>
+        </w:tc>
+        <w:tc>
+          <w:tcPr>
+            <w:tcBorders>
+              <w:top w:val="single" w:sz="16" w:space="0" w:color="D3D3D3"/>
+              <w:bottom w:val="single" w:sz="16" w:space="0" w:color="D3D3D3"/>
+            </w:tcBorders>
+          </w:tcPr>
+          <w:p>
+            <w:pPr>
+              <w:spacing w:before="0" w:after="60"/>
+              <w:keepNext/>
+              <w:jc w:val="center"/>
+            </w:pPr>
+            <w:r>
+              <w:rPr>
+                <w:b w:val="true"/>
+                <w:rFonts w:ascii="Calibri" w:hAnsi="Calibri"/>
+                <w:sz w:val="20"/>
+              </w:rPr>
+              <w:t xml:space="preserve">2021</w:t>
+            </w:r>
+            <w:r>
+              <w:rPr>
+                <w:rFonts w:ascii="Calibri" w:hAnsi="Calibri"/>
+                <w:sz w:val="20"/>
+              </w:rPr>
+              <w:t xml:space="preserve"/>
+            </w:r>
+            <w:r xmlns:w="http://schemas.openxmlformats.org/wordprocessingml/2006/main">
+              <w:rPr>
+                <w:rFonts w:ascii="Calibri" w:hAnsi="Calibri"/>
+                <w:sz w:val="20"/>
+              </w:rPr>
+              <w:t xml:space="preserve"> </w:t>
+            </w:r>
+            <w:r>
+              <w:rPr>
+                <w:rFonts w:ascii="Calibri" w:hAnsi="Calibri"/>
+                <w:sz w:val="20"/>
+              </w:rPr>
+              <w:t xml:space="preserve">N = 8,719,348</w:t>
+            </w:r>
+            <w:r>
+              <w:rPr>
+                <w:vertAlign w:val="superscript"/>
+                <w:i/>
+                <w:rFonts w:ascii="Calibri" w:hAnsi="Calibri"/>
+                <w:sz w:val="20"/>
+              </w:rPr>
+              <w:t xml:space="default">1</w:t>
+            </w:r>
+          </w:p>
+        </w:tc>
+        <w:tc>
+          <w:tcPr>
+            <w:tcBorders>
+              <w:top w:val="single" w:sz="16" w:space="0" w:color="D3D3D3"/>
+              <w:bottom w:val="single" w:sz="16" w:space="0" w:color="D3D3D3"/>
+            </w:tcBorders>
+          </w:tcPr>
+          <w:p>
+            <w:pPr>
+              <w:spacing w:before="0" w:after="60"/>
+              <w:keepNext/>
+              <w:jc w:val="center"/>
+            </w:pPr>
+            <w:r>
+              <w:rPr>
+                <w:b w:val="true"/>
+                <w:rFonts w:ascii="Calibri" w:hAnsi="Calibri"/>
+                <w:sz w:val="20"/>
+              </w:rPr>
+              <w:t xml:space="preserve">2022</w:t>
+            </w:r>
+            <w:r>
+              <w:rPr>
+                <w:rFonts w:ascii="Calibri" w:hAnsi="Calibri"/>
+                <w:sz w:val="20"/>
+              </w:rPr>
+              <w:t xml:space="preserve"/>
+            </w:r>
+            <w:r xmlns:w="http://schemas.openxmlformats.org/wordprocessingml/2006/main">
+              <w:rPr>
+                <w:rFonts w:ascii="Calibri" w:hAnsi="Calibri"/>
+                <w:sz w:val="20"/>
+              </w:rPr>
+              <w:t xml:space="preserve"> </w:t>
+            </w:r>
+            <w:r>
+              <w:rPr>
+                <w:rFonts w:ascii="Calibri" w:hAnsi="Calibri"/>
+                <w:sz w:val="20"/>
+              </w:rPr>
+              <w:t xml:space="preserve">N = 10,831,620</w:t>
+            </w:r>
+            <w:r>
+              <w:rPr>
+                <w:vertAlign w:val="superscript"/>
+                <w:i/>
+                <w:rFonts w:ascii="Calibri" w:hAnsi="Calibri"/>
+                <w:sz w:val="20"/>
+              </w:rPr>
+              <w:t xml:space="default">1</w:t>
+            </w:r>
+          </w:p>
+        </w:tc>
+        <w:tc>
+          <w:tcPr>
+            <w:tcBorders>
+              <w:top w:val="single" w:sz="16" w:space="0" w:color="D3D3D3"/>
+              <w:bottom w:val="single" w:sz="16" w:space="0" w:color="D3D3D3"/>
+            </w:tcBorders>
+          </w:tcPr>
+          <w:p>
+            <w:pPr>
+              <w:spacing w:before="0" w:after="60"/>
+              <w:keepNext/>
+              <w:jc w:val="center"/>
+            </w:pPr>
+            <w:r>
+              <w:rPr>
+                <w:b w:val="true"/>
+                <w:rFonts w:ascii="Calibri" w:hAnsi="Calibri"/>
+                <w:sz w:val="20"/>
+              </w:rPr>
+              <w:t xml:space="preserve">2023</w:t>
+            </w:r>
+            <w:r>
+              <w:rPr>
+                <w:rFonts w:ascii="Calibri" w:hAnsi="Calibri"/>
+                <w:sz w:val="20"/>
+              </w:rPr>
+              <w:t xml:space="preserve"/>
+            </w:r>
+            <w:r xmlns:w="http://schemas.openxmlformats.org/wordprocessingml/2006/main">
+              <w:rPr>
+                <w:rFonts w:ascii="Calibri" w:hAnsi="Calibri"/>
+                <w:sz w:val="20"/>
+              </w:rPr>
+              <w:t xml:space="preserve"> </w:t>
+            </w:r>
+            <w:r>
+              <w:rPr>
+                <w:rFonts w:ascii="Calibri" w:hAnsi="Calibri"/>
+                <w:sz w:val="20"/>
+              </w:rPr>
+              <w:t xml:space="preserve">N = 10,905,735</w:t>
+            </w:r>
+            <w:r>
+              <w:rPr>
+                <w:vertAlign w:val="superscript"/>
+                <w:i/>
+                <w:rFonts w:ascii="Calibri" w:hAnsi="Calibri"/>
+                <w:sz w:val="20"/>
+              </w:rPr>
+              <w:t xml:space="default">1</w:t>
+            </w:r>
+          </w:p>
+        </w:tc>
+        <w:tc>
+          <w:tcPr>
+            <w:tcBorders>
+              <w:top w:val="single" w:sz="16" w:space="0" w:color="D3D3D3"/>
+              <w:bottom w:val="single" w:sz="16" w:space="0" w:color="D3D3D3"/>
+              <w:end w:val="single" w:space="0" w:color="D3D3D3"/>
+            </w:tcBorders>
+          </w:tcPr>
+          <w:p>
+            <w:pPr>
+              <w:spacing w:before="0" w:after="60"/>
+              <w:keepNext/>
+              <w:jc w:val="center"/>
+            </w:pPr>
+            <w:r>
+              <w:rPr>
+                <w:b w:val="true"/>
+                <w:rFonts w:ascii="Calibri" w:hAnsi="Calibri"/>
+                <w:sz w:val="20"/>
+              </w:rPr>
+              <w:t xml:space="preserve">p-value</w:t>
+            </w:r>
+            <w:r>
+              <w:rPr>
+                <w:vertAlign w:val="superscript"/>
+                <w:i/>
+                <w:rFonts w:ascii="Calibri" w:hAnsi="Calibri"/>
+                <w:sz w:val="20"/>
+              </w:rPr>
+              <w:t xml:space="default">2</w:t>
             </w:r>
           </w:p>
         </w:tc>
@@ -217,79 +473,199 @@
                 <w:sz w:val="20"/>
                 <w:b w:val="true"/>
               </w:rPr>
-              <w:t xml:space="default">Number of unique ADHD drugs used</w:t>
-            </w:r>
-          </w:p>
-        </w:tc>
-        <w:tc>
-          <w:tcPr>
-            <w:tcBorders>
-              <w:top w:val="single" w:space="0" w:color="D3D3D3"/>
-              <w:bottom w:val="single" w:space="0" w:color="D3D3D3"/>
-              <w:start w:val="single" w:space="0" w:color="D3D3D3"/>
-              <w:end w:val="single" w:space="0" w:color="D3D3D3"/>
-            </w:tcBorders>
-          </w:tcPr>
-          <w:p>
-            <w:pPr>
-              <w:spacing w:before="0" w:after="60"/>
-              <w:keepNext/>
-              <w:jc w:val="center"/>
-            </w:pPr>
-            <w:r>
-              <w:rPr>
-                <w:rFonts w:ascii="Calibri" w:hAnsi="Calibri"/>
-                <w:sz w:val="20"/>
-              </w:rPr>
-              <w:t xml:space="default"/>
-            </w:r>
-          </w:p>
-        </w:tc>
-        <w:tc>
-          <w:tcPr>
-            <w:tcBorders>
-              <w:top w:val="single" w:space="0" w:color="D3D3D3"/>
-              <w:bottom w:val="single" w:space="0" w:color="D3D3D3"/>
-              <w:start w:val="single" w:space="0" w:color="D3D3D3"/>
-              <w:end w:val="single" w:space="0" w:color="D3D3D3"/>
-            </w:tcBorders>
-          </w:tcPr>
-          <w:p>
-            <w:pPr>
-              <w:spacing w:before="0" w:after="60"/>
-              <w:keepNext/>
-              <w:jc w:val="center"/>
-            </w:pPr>
-            <w:r>
-              <w:rPr>
-                <w:rFonts w:ascii="Calibri" w:hAnsi="Calibri"/>
-                <w:sz w:val="20"/>
-              </w:rPr>
-              <w:t xml:space="default"/>
-            </w:r>
-          </w:p>
-        </w:tc>
-        <w:tc>
-          <w:tcPr>
-            <w:tcBorders>
-              <w:top w:val="single" w:space="0" w:color="D3D3D3"/>
-              <w:bottom w:val="single" w:space="0" w:color="D3D3D3"/>
-              <w:start w:val="single" w:space="0" w:color="D3D3D3"/>
-              <w:end w:val="single" w:space="0" w:color="D3D3D3"/>
-            </w:tcBorders>
-          </w:tcPr>
-          <w:p>
-            <w:pPr>
-              <w:spacing w:before="0" w:after="60"/>
-              <w:keepNext/>
-              <w:jc w:val="center"/>
-            </w:pPr>
-            <w:r>
-              <w:rPr>
-                <w:rFonts w:ascii="Calibri" w:hAnsi="Calibri"/>
-                <w:sz w:val="20"/>
-              </w:rPr>
-              <w:t xml:space="default">0.076</w:t>
+              <w:t xml:space="default">Age at diagnosis (years)</w:t>
+            </w:r>
+          </w:p>
+        </w:tc>
+        <w:tc>
+          <w:tcPr>
+            <w:tcBorders>
+              <w:top w:val="single" w:space="0" w:color="D3D3D3"/>
+              <w:bottom w:val="single" w:space="0" w:color="D3D3D3"/>
+              <w:start w:val="single" w:space="0" w:color="D3D3D3"/>
+              <w:end w:val="single" w:space="0" w:color="D3D3D3"/>
+            </w:tcBorders>
+          </w:tcPr>
+          <w:p>
+            <w:pPr>
+              <w:spacing w:before="0" w:after="60"/>
+              <w:keepNext/>
+              <w:jc w:val="center"/>
+            </w:pPr>
+            <w:r>
+              <w:rPr>
+                <w:rFonts w:ascii="Calibri" w:hAnsi="Calibri"/>
+                <w:sz w:val="20"/>
+              </w:rPr>
+              <w:t xml:space="default">21.88 (14.24)</w:t>
+            </w:r>
+          </w:p>
+        </w:tc>
+        <w:tc>
+          <w:tcPr>
+            <w:tcBorders>
+              <w:top w:val="single" w:space="0" w:color="D3D3D3"/>
+              <w:bottom w:val="single" w:space="0" w:color="D3D3D3"/>
+              <w:start w:val="single" w:space="0" w:color="D3D3D3"/>
+              <w:end w:val="single" w:space="0" w:color="D3D3D3"/>
+            </w:tcBorders>
+          </w:tcPr>
+          <w:p>
+            <w:pPr>
+              <w:spacing w:before="0" w:after="60"/>
+              <w:keepNext/>
+              <w:jc w:val="center"/>
+            </w:pPr>
+            <w:r>
+              <w:rPr>
+                <w:rFonts w:ascii="Calibri" w:hAnsi="Calibri"/>
+                <w:sz w:val="20"/>
+              </w:rPr>
+              <w:t xml:space="default">22.77 (14.68)</w:t>
+            </w:r>
+          </w:p>
+        </w:tc>
+        <w:tc>
+          <w:tcPr>
+            <w:tcBorders>
+              <w:top w:val="single" w:space="0" w:color="D3D3D3"/>
+              <w:bottom w:val="single" w:space="0" w:color="D3D3D3"/>
+              <w:start w:val="single" w:space="0" w:color="D3D3D3"/>
+              <w:end w:val="single" w:space="0" w:color="D3D3D3"/>
+            </w:tcBorders>
+          </w:tcPr>
+          <w:p>
+            <w:pPr>
+              <w:spacing w:before="0" w:after="60"/>
+              <w:keepNext/>
+              <w:jc w:val="center"/>
+            </w:pPr>
+            <w:r>
+              <w:rPr>
+                <w:rFonts w:ascii="Calibri" w:hAnsi="Calibri"/>
+                <w:sz w:val="20"/>
+              </w:rPr>
+              <w:t xml:space="default">23.34 (14.90)</w:t>
+            </w:r>
+          </w:p>
+        </w:tc>
+        <w:tc>
+          <w:tcPr>
+            <w:tcBorders>
+              <w:top w:val="single" w:space="0" w:color="D3D3D3"/>
+              <w:bottom w:val="single" w:space="0" w:color="D3D3D3"/>
+              <w:start w:val="single" w:space="0" w:color="D3D3D3"/>
+              <w:end w:val="single" w:space="0" w:color="D3D3D3"/>
+            </w:tcBorders>
+          </w:tcPr>
+          <w:p>
+            <w:pPr>
+              <w:spacing w:before="0" w:after="60"/>
+              <w:keepNext/>
+              <w:jc w:val="center"/>
+            </w:pPr>
+            <w:r>
+              <w:rPr>
+                <w:rFonts w:ascii="Calibri" w:hAnsi="Calibri"/>
+                <w:sz w:val="20"/>
+              </w:rPr>
+              <w:t xml:space="default">23.58 (14.34)</w:t>
+            </w:r>
+          </w:p>
+        </w:tc>
+        <w:tc>
+          <w:tcPr>
+            <w:tcBorders>
+              <w:top w:val="single" w:space="0" w:color="D3D3D3"/>
+              <w:bottom w:val="single" w:space="0" w:color="D3D3D3"/>
+              <w:start w:val="single" w:space="0" w:color="D3D3D3"/>
+              <w:end w:val="single" w:space="0" w:color="D3D3D3"/>
+            </w:tcBorders>
+          </w:tcPr>
+          <w:p>
+            <w:pPr>
+              <w:spacing w:before="0" w:after="60"/>
+              <w:keepNext/>
+              <w:jc w:val="center"/>
+            </w:pPr>
+            <w:r>
+              <w:rPr>
+                <w:rFonts w:ascii="Calibri" w:hAnsi="Calibri"/>
+                <w:sz w:val="20"/>
+              </w:rPr>
+              <w:t xml:space="default">24.90 (14.28)</w:t>
+            </w:r>
+          </w:p>
+        </w:tc>
+        <w:tc>
+          <w:tcPr>
+            <w:tcBorders>
+              <w:top w:val="single" w:space="0" w:color="D3D3D3"/>
+              <w:bottom w:val="single" w:space="0" w:color="D3D3D3"/>
+              <w:start w:val="single" w:space="0" w:color="D3D3D3"/>
+              <w:end w:val="single" w:space="0" w:color="D3D3D3"/>
+            </w:tcBorders>
+          </w:tcPr>
+          <w:p>
+            <w:pPr>
+              <w:spacing w:before="0" w:after="60"/>
+              <w:keepNext/>
+              <w:jc w:val="center"/>
+            </w:pPr>
+            <w:r>
+              <w:rPr>
+                <w:rFonts w:ascii="Calibri" w:hAnsi="Calibri"/>
+                <w:sz w:val="20"/>
+              </w:rPr>
+              <w:t xml:space="default">25.32 (14.32)</w:t>
+            </w:r>
+          </w:p>
+        </w:tc>
+        <w:tc>
+          <w:tcPr>
+            <w:tcBorders>
+              <w:top w:val="single" w:space="0" w:color="D3D3D3"/>
+              <w:bottom w:val="single" w:space="0" w:color="D3D3D3"/>
+              <w:start w:val="single" w:space="0" w:color="D3D3D3"/>
+              <w:end w:val="single" w:space="0" w:color="D3D3D3"/>
+            </w:tcBorders>
+          </w:tcPr>
+          <w:p>
+            <w:pPr>
+              <w:spacing w:before="0" w:after="60"/>
+              <w:keepNext/>
+              <w:jc w:val="center"/>
+            </w:pPr>
+            <w:r>
+              <w:rPr>
+                <w:rFonts w:ascii="Calibri" w:hAnsi="Calibri"/>
+                <w:sz w:val="20"/>
+              </w:rPr>
+              <w:t xml:space="default">24.80 (13.95)</w:t>
+            </w:r>
+          </w:p>
+        </w:tc>
+        <w:tc>
+          <w:tcPr>
+            <w:tcBorders>
+              <w:top w:val="single" w:space="0" w:color="D3D3D3"/>
+              <w:bottom w:val="single" w:space="0" w:color="D3D3D3"/>
+              <w:start w:val="single" w:space="0" w:color="D3D3D3"/>
+              <w:end w:val="single" w:space="0" w:color="D3D3D3"/>
+            </w:tcBorders>
+          </w:tcPr>
+          <w:p>
+            <w:pPr>
+              <w:spacing w:before="0" w:after="60"/>
+              <w:keepNext/>
+              <w:jc w:val="center"/>
+            </w:pPr>
+            <w:r>
+              <w:rPr>
+                <w:rFonts w:ascii="Calibri" w:hAnsi="Calibri"/>
+                <w:sz w:val="20"/>
+              </w:rPr>
+              <w:t xml:space="default">&lt;0.001</w:t>
             </w:r>
           </w:p>
         </w:tc>
@@ -317,56 +693,9 @@
               <w:rPr>
                 <w:rFonts w:ascii="Calibri" w:hAnsi="Calibri"/>
                 <w:sz w:val="20"/>
-              </w:rPr>
-              <w:t xml:space="default">    1</w:t>
-            </w:r>
-          </w:p>
-        </w:tc>
-        <w:tc>
-          <w:tcPr>
-            <w:tcBorders>
-              <w:top w:val="single" w:space="0" w:color="D3D3D3"/>
-              <w:bottom w:val="single" w:space="0" w:color="D3D3D3"/>
-              <w:start w:val="single" w:space="0" w:color="D3D3D3"/>
-              <w:end w:val="single" w:space="0" w:color="D3D3D3"/>
-            </w:tcBorders>
-          </w:tcPr>
-          <w:p>
-            <w:pPr>
-              <w:spacing w:before="0" w:after="60"/>
-              <w:keepNext/>
-              <w:jc w:val="center"/>
-            </w:pPr>
-            <w:r>
-              <w:rPr>
-                <w:rFonts w:ascii="Calibri" w:hAnsi="Calibri"/>
-                <w:sz w:val="20"/>
-              </w:rPr>
-              <w:t xml:space="default">2,040,298 (98%)</w:t>
-            </w:r>
-          </w:p>
-        </w:tc>
-        <w:tc>
-          <w:tcPr>
-            <w:tcBorders>
-              <w:top w:val="single" w:space="0" w:color="D3D3D3"/>
-              <w:bottom w:val="single" w:space="0" w:color="D3D3D3"/>
-              <w:start w:val="single" w:space="0" w:color="D3D3D3"/>
-              <w:end w:val="single" w:space="0" w:color="D3D3D3"/>
-            </w:tcBorders>
-          </w:tcPr>
-          <w:p>
-            <w:pPr>
-              <w:spacing w:before="0" w:after="60"/>
-              <w:keepNext/>
-              <w:jc w:val="center"/>
-            </w:pPr>
-            <w:r>
-              <w:rPr>
-                <w:rFonts w:ascii="Calibri" w:hAnsi="Calibri"/>
-                <w:sz w:val="20"/>
-              </w:rPr>
-              <w:t xml:space="default">2,013,440 (94%)</w:t>
+                <w:b w:val="true"/>
+              </w:rPr>
+              <w:t xml:space="default">Number of unique stimulant classes</w:t>
             </w:r>
           </w:p>
         </w:tc>
@@ -391,6 +720,174 @@
                 <w:sz w:val="20"/>
               </w:rPr>
               <w:t xml:space="default"/>
+            </w:r>
+          </w:p>
+        </w:tc>
+        <w:tc>
+          <w:tcPr>
+            <w:tcBorders>
+              <w:top w:val="single" w:space="0" w:color="D3D3D3"/>
+              <w:bottom w:val="single" w:space="0" w:color="D3D3D3"/>
+              <w:start w:val="single" w:space="0" w:color="D3D3D3"/>
+              <w:end w:val="single" w:space="0" w:color="D3D3D3"/>
+            </w:tcBorders>
+          </w:tcPr>
+          <w:p>
+            <w:pPr>
+              <w:spacing w:before="0" w:after="60"/>
+              <w:keepNext/>
+              <w:jc w:val="center"/>
+            </w:pPr>
+            <w:r>
+              <w:rPr>
+                <w:rFonts w:ascii="Calibri" w:hAnsi="Calibri"/>
+                <w:sz w:val="20"/>
+              </w:rPr>
+              <w:t xml:space="default"/>
+            </w:r>
+          </w:p>
+        </w:tc>
+        <w:tc>
+          <w:tcPr>
+            <w:tcBorders>
+              <w:top w:val="single" w:space="0" w:color="D3D3D3"/>
+              <w:bottom w:val="single" w:space="0" w:color="D3D3D3"/>
+              <w:start w:val="single" w:space="0" w:color="D3D3D3"/>
+              <w:end w:val="single" w:space="0" w:color="D3D3D3"/>
+            </w:tcBorders>
+          </w:tcPr>
+          <w:p>
+            <w:pPr>
+              <w:spacing w:before="0" w:after="60"/>
+              <w:keepNext/>
+              <w:jc w:val="center"/>
+            </w:pPr>
+            <w:r>
+              <w:rPr>
+                <w:rFonts w:ascii="Calibri" w:hAnsi="Calibri"/>
+                <w:sz w:val="20"/>
+              </w:rPr>
+              <w:t xml:space="default"/>
+            </w:r>
+          </w:p>
+        </w:tc>
+        <w:tc>
+          <w:tcPr>
+            <w:tcBorders>
+              <w:top w:val="single" w:space="0" w:color="D3D3D3"/>
+              <w:bottom w:val="single" w:space="0" w:color="D3D3D3"/>
+              <w:start w:val="single" w:space="0" w:color="D3D3D3"/>
+              <w:end w:val="single" w:space="0" w:color="D3D3D3"/>
+            </w:tcBorders>
+          </w:tcPr>
+          <w:p>
+            <w:pPr>
+              <w:spacing w:before="0" w:after="60"/>
+              <w:keepNext/>
+              <w:jc w:val="center"/>
+            </w:pPr>
+            <w:r>
+              <w:rPr>
+                <w:rFonts w:ascii="Calibri" w:hAnsi="Calibri"/>
+                <w:sz w:val="20"/>
+              </w:rPr>
+              <w:t xml:space="default"/>
+            </w:r>
+          </w:p>
+        </w:tc>
+        <w:tc>
+          <w:tcPr>
+            <w:tcBorders>
+              <w:top w:val="single" w:space="0" w:color="D3D3D3"/>
+              <w:bottom w:val="single" w:space="0" w:color="D3D3D3"/>
+              <w:start w:val="single" w:space="0" w:color="D3D3D3"/>
+              <w:end w:val="single" w:space="0" w:color="D3D3D3"/>
+            </w:tcBorders>
+          </w:tcPr>
+          <w:p>
+            <w:pPr>
+              <w:spacing w:before="0" w:after="60"/>
+              <w:keepNext/>
+              <w:jc w:val="center"/>
+            </w:pPr>
+            <w:r>
+              <w:rPr>
+                <w:rFonts w:ascii="Calibri" w:hAnsi="Calibri"/>
+                <w:sz w:val="20"/>
+              </w:rPr>
+              <w:t xml:space="default"/>
+            </w:r>
+          </w:p>
+        </w:tc>
+        <w:tc>
+          <w:tcPr>
+            <w:tcBorders>
+              <w:top w:val="single" w:space="0" w:color="D3D3D3"/>
+              <w:bottom w:val="single" w:space="0" w:color="D3D3D3"/>
+              <w:start w:val="single" w:space="0" w:color="D3D3D3"/>
+              <w:end w:val="single" w:space="0" w:color="D3D3D3"/>
+            </w:tcBorders>
+          </w:tcPr>
+          <w:p>
+            <w:pPr>
+              <w:spacing w:before="0" w:after="60"/>
+              <w:keepNext/>
+              <w:jc w:val="center"/>
+            </w:pPr>
+            <w:r>
+              <w:rPr>
+                <w:rFonts w:ascii="Calibri" w:hAnsi="Calibri"/>
+                <w:sz w:val="20"/>
+              </w:rPr>
+              <w:t xml:space="default"/>
+            </w:r>
+          </w:p>
+        </w:tc>
+        <w:tc>
+          <w:tcPr>
+            <w:tcBorders>
+              <w:top w:val="single" w:space="0" w:color="D3D3D3"/>
+              <w:bottom w:val="single" w:space="0" w:color="D3D3D3"/>
+              <w:start w:val="single" w:space="0" w:color="D3D3D3"/>
+              <w:end w:val="single" w:space="0" w:color="D3D3D3"/>
+            </w:tcBorders>
+          </w:tcPr>
+          <w:p>
+            <w:pPr>
+              <w:spacing w:before="0" w:after="60"/>
+              <w:keepNext/>
+              <w:jc w:val="center"/>
+            </w:pPr>
+            <w:r>
+              <w:rPr>
+                <w:rFonts w:ascii="Calibri" w:hAnsi="Calibri"/>
+                <w:sz w:val="20"/>
+              </w:rPr>
+              <w:t xml:space="default"/>
+            </w:r>
+          </w:p>
+        </w:tc>
+        <w:tc>
+          <w:tcPr>
+            <w:tcBorders>
+              <w:top w:val="single" w:space="0" w:color="D3D3D3"/>
+              <w:bottom w:val="single" w:space="0" w:color="D3D3D3"/>
+              <w:start w:val="single" w:space="0" w:color="D3D3D3"/>
+              <w:end w:val="single" w:space="0" w:color="D3D3D3"/>
+            </w:tcBorders>
+          </w:tcPr>
+          <w:p>
+            <w:pPr>
+              <w:spacing w:before="0" w:after="60"/>
+              <w:keepNext/>
+              <w:jc w:val="center"/>
+            </w:pPr>
+            <w:r>
+              <w:rPr>
+                <w:rFonts w:ascii="Calibri" w:hAnsi="Calibri"/>
+                <w:sz w:val="20"/>
+              </w:rPr>
+              <w:t xml:space="default">0.7</w:t>
             </w:r>
           </w:p>
         </w:tc>
@@ -419,55 +916,175 @@
                 <w:rFonts w:ascii="Calibri" w:hAnsi="Calibri"/>
                 <w:sz w:val="20"/>
               </w:rPr>
-              <w:t xml:space="default">    2</w:t>
-            </w:r>
-          </w:p>
-        </w:tc>
-        <w:tc>
-          <w:tcPr>
-            <w:tcBorders>
-              <w:top w:val="single" w:space="0" w:color="D3D3D3"/>
-              <w:bottom w:val="single" w:space="0" w:color="D3D3D3"/>
-              <w:start w:val="single" w:space="0" w:color="D3D3D3"/>
-              <w:end w:val="single" w:space="0" w:color="D3D3D3"/>
-            </w:tcBorders>
-          </w:tcPr>
-          <w:p>
-            <w:pPr>
-              <w:spacing w:before="0" w:after="60"/>
-              <w:keepNext/>
-              <w:jc w:val="center"/>
-            </w:pPr>
-            <w:r>
-              <w:rPr>
-                <w:rFonts w:ascii="Calibri" w:hAnsi="Calibri"/>
-                <w:sz w:val="20"/>
-              </w:rPr>
-              <w:t xml:space="default">45,114 (2.2%)</w:t>
-            </w:r>
-          </w:p>
-        </w:tc>
-        <w:tc>
-          <w:tcPr>
-            <w:tcBorders>
-              <w:top w:val="single" w:space="0" w:color="D3D3D3"/>
-              <w:bottom w:val="single" w:space="0" w:color="D3D3D3"/>
-              <w:start w:val="single" w:space="0" w:color="D3D3D3"/>
-              <w:end w:val="single" w:space="0" w:color="D3D3D3"/>
-            </w:tcBorders>
-          </w:tcPr>
-          <w:p>
-            <w:pPr>
-              <w:spacing w:before="0" w:after="60"/>
-              <w:keepNext/>
-              <w:jc w:val="center"/>
-            </w:pPr>
-            <w:r>
-              <w:rPr>
-                <w:rFonts w:ascii="Calibri" w:hAnsi="Calibri"/>
-                <w:sz w:val="20"/>
-              </w:rPr>
-              <w:t xml:space="default">123,597 (5.8%)</w:t>
+              <w:t xml:space="default">    1</w:t>
+            </w:r>
+          </w:p>
+        </w:tc>
+        <w:tc>
+          <w:tcPr>
+            <w:tcBorders>
+              <w:top w:val="single" w:space="0" w:color="D3D3D3"/>
+              <w:bottom w:val="single" w:space="0" w:color="D3D3D3"/>
+              <w:start w:val="single" w:space="0" w:color="D3D3D3"/>
+              <w:end w:val="single" w:space="0" w:color="D3D3D3"/>
+            </w:tcBorders>
+          </w:tcPr>
+          <w:p>
+            <w:pPr>
+              <w:spacing w:before="0" w:after="60"/>
+              <w:keepNext/>
+              <w:jc w:val="center"/>
+            </w:pPr>
+            <w:r>
+              <w:rPr>
+                <w:rFonts w:ascii="Calibri" w:hAnsi="Calibri"/>
+                <w:sz w:val="20"/>
+              </w:rPr>
+              <w:t xml:space="default">5,757,754 (94%)</w:t>
+            </w:r>
+          </w:p>
+        </w:tc>
+        <w:tc>
+          <w:tcPr>
+            <w:tcBorders>
+              <w:top w:val="single" w:space="0" w:color="D3D3D3"/>
+              <w:bottom w:val="single" w:space="0" w:color="D3D3D3"/>
+              <w:start w:val="single" w:space="0" w:color="D3D3D3"/>
+              <w:end w:val="single" w:space="0" w:color="D3D3D3"/>
+            </w:tcBorders>
+          </w:tcPr>
+          <w:p>
+            <w:pPr>
+              <w:spacing w:before="0" w:after="60"/>
+              <w:keepNext/>
+              <w:jc w:val="center"/>
+            </w:pPr>
+            <w:r>
+              <w:rPr>
+                <w:rFonts w:ascii="Calibri" w:hAnsi="Calibri"/>
+                <w:sz w:val="20"/>
+              </w:rPr>
+              <w:t xml:space="default">6,352,517 (96%)</w:t>
+            </w:r>
+          </w:p>
+        </w:tc>
+        <w:tc>
+          <w:tcPr>
+            <w:tcBorders>
+              <w:top w:val="single" w:space="0" w:color="D3D3D3"/>
+              <w:bottom w:val="single" w:space="0" w:color="D3D3D3"/>
+              <w:start w:val="single" w:space="0" w:color="D3D3D3"/>
+              <w:end w:val="single" w:space="0" w:color="D3D3D3"/>
+            </w:tcBorders>
+          </w:tcPr>
+          <w:p>
+            <w:pPr>
+              <w:spacing w:before="0" w:after="60"/>
+              <w:keepNext/>
+              <w:jc w:val="center"/>
+            </w:pPr>
+            <w:r>
+              <w:rPr>
+                <w:rFonts w:ascii="Calibri" w:hAnsi="Calibri"/>
+                <w:sz w:val="20"/>
+              </w:rPr>
+              <w:t xml:space="default">5,943,109 (93%)</w:t>
+            </w:r>
+          </w:p>
+        </w:tc>
+        <w:tc>
+          <w:tcPr>
+            <w:tcBorders>
+              <w:top w:val="single" w:space="0" w:color="D3D3D3"/>
+              <w:bottom w:val="single" w:space="0" w:color="D3D3D3"/>
+              <w:start w:val="single" w:space="0" w:color="D3D3D3"/>
+              <w:end w:val="single" w:space="0" w:color="D3D3D3"/>
+            </w:tcBorders>
+          </w:tcPr>
+          <w:p>
+            <w:pPr>
+              <w:spacing w:before="0" w:after="60"/>
+              <w:keepNext/>
+              <w:jc w:val="center"/>
+            </w:pPr>
+            <w:r>
+              <w:rPr>
+                <w:rFonts w:ascii="Calibri" w:hAnsi="Calibri"/>
+                <w:sz w:val="20"/>
+              </w:rPr>
+              <w:t xml:space="default">6,151,647 (94%)</w:t>
+            </w:r>
+          </w:p>
+        </w:tc>
+        <w:tc>
+          <w:tcPr>
+            <w:tcBorders>
+              <w:top w:val="single" w:space="0" w:color="D3D3D3"/>
+              <w:bottom w:val="single" w:space="0" w:color="D3D3D3"/>
+              <w:start w:val="single" w:space="0" w:color="D3D3D3"/>
+              <w:end w:val="single" w:space="0" w:color="D3D3D3"/>
+            </w:tcBorders>
+          </w:tcPr>
+          <w:p>
+            <w:pPr>
+              <w:spacing w:before="0" w:after="60"/>
+              <w:keepNext/>
+              <w:jc w:val="center"/>
+            </w:pPr>
+            <w:r>
+              <w:rPr>
+                <w:rFonts w:ascii="Calibri" w:hAnsi="Calibri"/>
+                <w:sz w:val="20"/>
+              </w:rPr>
+              <w:t xml:space="default">5,994,721 (92%)</w:t>
+            </w:r>
+          </w:p>
+        </w:tc>
+        <w:tc>
+          <w:tcPr>
+            <w:tcBorders>
+              <w:top w:val="single" w:space="0" w:color="D3D3D3"/>
+              <w:bottom w:val="single" w:space="0" w:color="D3D3D3"/>
+              <w:start w:val="single" w:space="0" w:color="D3D3D3"/>
+              <w:end w:val="single" w:space="0" w:color="D3D3D3"/>
+            </w:tcBorders>
+          </w:tcPr>
+          <w:p>
+            <w:pPr>
+              <w:spacing w:before="0" w:after="60"/>
+              <w:keepNext/>
+              <w:jc w:val="center"/>
+            </w:pPr>
+            <w:r>
+              <w:rPr>
+                <w:rFonts w:ascii="Calibri" w:hAnsi="Calibri"/>
+                <w:sz w:val="20"/>
+              </w:rPr>
+              <w:t xml:space="default">7,582,475 (95%)</w:t>
+            </w:r>
+          </w:p>
+        </w:tc>
+        <w:tc>
+          <w:tcPr>
+            <w:tcBorders>
+              <w:top w:val="single" w:space="0" w:color="D3D3D3"/>
+              <w:bottom w:val="single" w:space="0" w:color="D3D3D3"/>
+              <w:start w:val="single" w:space="0" w:color="D3D3D3"/>
+              <w:end w:val="single" w:space="0" w:color="D3D3D3"/>
+            </w:tcBorders>
+          </w:tcPr>
+          <w:p>
+            <w:pPr>
+              <w:spacing w:before="0" w:after="60"/>
+              <w:keepNext/>
+              <w:jc w:val="center"/>
+            </w:pPr>
+            <w:r>
+              <w:rPr>
+                <w:rFonts w:ascii="Calibri" w:hAnsi="Calibri"/>
+                <w:sz w:val="20"/>
+              </w:rPr>
+              <w:t xml:space="default">7,331,492 (94%)</w:t>
             </w:r>
           </w:p>
         </w:tc>
@@ -519,81 +1136,200 @@
               <w:rPr>
                 <w:rFonts w:ascii="Calibri" w:hAnsi="Calibri"/>
                 <w:sz w:val="20"/>
-                <w:b w:val="true"/>
-              </w:rPr>
-              <w:t xml:space="default">Number of ADHD medication fills</w:t>
-            </w:r>
-          </w:p>
-        </w:tc>
-        <w:tc>
-          <w:tcPr>
-            <w:tcBorders>
-              <w:top w:val="single" w:space="0" w:color="D3D3D3"/>
-              <w:bottom w:val="single" w:space="0" w:color="D3D3D3"/>
-              <w:start w:val="single" w:space="0" w:color="D3D3D3"/>
-              <w:end w:val="single" w:space="0" w:color="D3D3D3"/>
-            </w:tcBorders>
-          </w:tcPr>
-          <w:p>
-            <w:pPr>
-              <w:spacing w:before="0" w:after="60"/>
-              <w:keepNext/>
-              <w:jc w:val="center"/>
-            </w:pPr>
-            <w:r>
-              <w:rPr>
-                <w:rFonts w:ascii="Calibri" w:hAnsi="Calibri"/>
-                <w:sz w:val="20"/>
-              </w:rPr>
-              <w:t xml:space="default">5 (4)</w:t>
-            </w:r>
-          </w:p>
-        </w:tc>
-        <w:tc>
-          <w:tcPr>
-            <w:tcBorders>
-              <w:top w:val="single" w:space="0" w:color="D3D3D3"/>
-              <w:bottom w:val="single" w:space="0" w:color="D3D3D3"/>
-              <w:start w:val="single" w:space="0" w:color="D3D3D3"/>
-              <w:end w:val="single" w:space="0" w:color="D3D3D3"/>
-            </w:tcBorders>
-          </w:tcPr>
-          <w:p>
-            <w:pPr>
-              <w:spacing w:before="0" w:after="60"/>
-              <w:keepNext/>
-              <w:jc w:val="center"/>
-            </w:pPr>
-            <w:r>
-              <w:rPr>
-                <w:rFonts w:ascii="Calibri" w:hAnsi="Calibri"/>
-                <w:sz w:val="20"/>
-              </w:rPr>
-              <w:t xml:space="default">6 (5)</w:t>
-            </w:r>
-          </w:p>
-        </w:tc>
-        <w:tc>
-          <w:tcPr>
-            <w:tcBorders>
-              <w:top w:val="single" w:space="0" w:color="D3D3D3"/>
-              <w:bottom w:val="single" w:space="0" w:color="D3D3D3"/>
-              <w:start w:val="single" w:space="0" w:color="D3D3D3"/>
-              <w:end w:val="single" w:space="0" w:color="D3D3D3"/>
-            </w:tcBorders>
-          </w:tcPr>
-          <w:p>
-            <w:pPr>
-              <w:spacing w:before="0" w:after="60"/>
-              <w:keepNext/>
-              <w:jc w:val="center"/>
-            </w:pPr>
-            <w:r>
-              <w:rPr>
-                <w:rFonts w:ascii="Calibri" w:hAnsi="Calibri"/>
-                <w:sz w:val="20"/>
-              </w:rPr>
-              <w:t xml:space="default">&gt;0.9</w:t>
+              </w:rPr>
+              <w:t xml:space="default">    2</w:t>
+            </w:r>
+          </w:p>
+        </w:tc>
+        <w:tc>
+          <w:tcPr>
+            <w:tcBorders>
+              <w:top w:val="single" w:space="0" w:color="D3D3D3"/>
+              <w:bottom w:val="single" w:space="0" w:color="D3D3D3"/>
+              <w:start w:val="single" w:space="0" w:color="D3D3D3"/>
+              <w:end w:val="single" w:space="0" w:color="D3D3D3"/>
+            </w:tcBorders>
+          </w:tcPr>
+          <w:p>
+            <w:pPr>
+              <w:spacing w:before="0" w:after="60"/>
+              <w:keepNext/>
+              <w:jc w:val="center"/>
+            </w:pPr>
+            <w:r>
+              <w:rPr>
+                <w:rFonts w:ascii="Calibri" w:hAnsi="Calibri"/>
+                <w:sz w:val="20"/>
+              </w:rPr>
+              <w:t xml:space="default">357,106 (5.8%)</w:t>
+            </w:r>
+          </w:p>
+        </w:tc>
+        <w:tc>
+          <w:tcPr>
+            <w:tcBorders>
+              <w:top w:val="single" w:space="0" w:color="D3D3D3"/>
+              <w:bottom w:val="single" w:space="0" w:color="D3D3D3"/>
+              <w:start w:val="single" w:space="0" w:color="D3D3D3"/>
+              <w:end w:val="single" w:space="0" w:color="D3D3D3"/>
+            </w:tcBorders>
+          </w:tcPr>
+          <w:p>
+            <w:pPr>
+              <w:spacing w:before="0" w:after="60"/>
+              <w:keepNext/>
+              <w:jc w:val="center"/>
+            </w:pPr>
+            <w:r>
+              <w:rPr>
+                <w:rFonts w:ascii="Calibri" w:hAnsi="Calibri"/>
+                <w:sz w:val="20"/>
+              </w:rPr>
+              <w:t xml:space="default">237,484 (3.6%)</w:t>
+            </w:r>
+          </w:p>
+        </w:tc>
+        <w:tc>
+          <w:tcPr>
+            <w:tcBorders>
+              <w:top w:val="single" w:space="0" w:color="D3D3D3"/>
+              <w:bottom w:val="single" w:space="0" w:color="D3D3D3"/>
+              <w:start w:val="single" w:space="0" w:color="D3D3D3"/>
+              <w:end w:val="single" w:space="0" w:color="D3D3D3"/>
+            </w:tcBorders>
+          </w:tcPr>
+          <w:p>
+            <w:pPr>
+              <w:spacing w:before="0" w:after="60"/>
+              <w:keepNext/>
+              <w:jc w:val="center"/>
+            </w:pPr>
+            <w:r>
+              <w:rPr>
+                <w:rFonts w:ascii="Calibri" w:hAnsi="Calibri"/>
+                <w:sz w:val="20"/>
+              </w:rPr>
+              <w:t xml:space="default">405,372 (6.4%)</w:t>
+            </w:r>
+          </w:p>
+        </w:tc>
+        <w:tc>
+          <w:tcPr>
+            <w:tcBorders>
+              <w:top w:val="single" w:space="0" w:color="D3D3D3"/>
+              <w:bottom w:val="single" w:space="0" w:color="D3D3D3"/>
+              <w:start w:val="single" w:space="0" w:color="D3D3D3"/>
+              <w:end w:val="single" w:space="0" w:color="D3D3D3"/>
+            </w:tcBorders>
+          </w:tcPr>
+          <w:p>
+            <w:pPr>
+              <w:spacing w:before="0" w:after="60"/>
+              <w:keepNext/>
+              <w:jc w:val="center"/>
+            </w:pPr>
+            <w:r>
+              <w:rPr>
+                <w:rFonts w:ascii="Calibri" w:hAnsi="Calibri"/>
+                <w:sz w:val="20"/>
+              </w:rPr>
+              <w:t xml:space="default">348,788 (5.4%)</w:t>
+            </w:r>
+          </w:p>
+        </w:tc>
+        <w:tc>
+          <w:tcPr>
+            <w:tcBorders>
+              <w:top w:val="single" w:space="0" w:color="D3D3D3"/>
+              <w:bottom w:val="single" w:space="0" w:color="D3D3D3"/>
+              <w:start w:val="single" w:space="0" w:color="D3D3D3"/>
+              <w:end w:val="single" w:space="0" w:color="D3D3D3"/>
+            </w:tcBorders>
+          </w:tcPr>
+          <w:p>
+            <w:pPr>
+              <w:spacing w:before="0" w:after="60"/>
+              <w:keepNext/>
+              <w:jc w:val="center"/>
+            </w:pPr>
+            <w:r>
+              <w:rPr>
+                <w:rFonts w:ascii="Calibri" w:hAnsi="Calibri"/>
+                <w:sz w:val="20"/>
+              </w:rPr>
+              <w:t xml:space="default">480,460 (7.4%)</w:t>
+            </w:r>
+          </w:p>
+        </w:tc>
+        <w:tc>
+          <w:tcPr>
+            <w:tcBorders>
+              <w:top w:val="single" w:space="0" w:color="D3D3D3"/>
+              <w:bottom w:val="single" w:space="0" w:color="D3D3D3"/>
+              <w:start w:val="single" w:space="0" w:color="D3D3D3"/>
+              <w:end w:val="single" w:space="0" w:color="D3D3D3"/>
+            </w:tcBorders>
+          </w:tcPr>
+          <w:p>
+            <w:pPr>
+              <w:spacing w:before="0" w:after="60"/>
+              <w:keepNext/>
+              <w:jc w:val="center"/>
+            </w:pPr>
+            <w:r>
+              <w:rPr>
+                <w:rFonts w:ascii="Calibri" w:hAnsi="Calibri"/>
+                <w:sz w:val="20"/>
+              </w:rPr>
+              <w:t xml:space="default">394,819 (4.9%)</w:t>
+            </w:r>
+          </w:p>
+        </w:tc>
+        <w:tc>
+          <w:tcPr>
+            <w:tcBorders>
+              <w:top w:val="single" w:space="0" w:color="D3D3D3"/>
+              <w:bottom w:val="single" w:space="0" w:color="D3D3D3"/>
+              <w:start w:val="single" w:space="0" w:color="D3D3D3"/>
+              <w:end w:val="single" w:space="0" w:color="D3D3D3"/>
+            </w:tcBorders>
+          </w:tcPr>
+          <w:p>
+            <w:pPr>
+              <w:spacing w:before="0" w:after="60"/>
+              <w:keepNext/>
+              <w:jc w:val="center"/>
+            </w:pPr>
+            <w:r>
+              <w:rPr>
+                <w:rFonts w:ascii="Calibri" w:hAnsi="Calibri"/>
+                <w:sz w:val="20"/>
+              </w:rPr>
+              <w:t xml:space="default">430,778 (5.5%)</w:t>
+            </w:r>
+          </w:p>
+        </w:tc>
+        <w:tc>
+          <w:tcPr>
+            <w:tcBorders>
+              <w:top w:val="single" w:space="0" w:color="D3D3D3"/>
+              <w:bottom w:val="single" w:space="0" w:color="D3D3D3"/>
+              <w:start w:val="single" w:space="0" w:color="D3D3D3"/>
+              <w:end w:val="single" w:space="0" w:color="D3D3D3"/>
+            </w:tcBorders>
+          </w:tcPr>
+          <w:p>
+            <w:pPr>
+              <w:spacing w:before="0" w:after="60"/>
+              <w:keepNext/>
+              <w:jc w:val="center"/>
+            </w:pPr>
+            <w:r>
+              <w:rPr>
+                <w:rFonts w:ascii="Calibri" w:hAnsi="Calibri"/>
+                <w:sz w:val="20"/>
+              </w:rPr>
+              <w:t xml:space="default"/>
             </w:r>
           </w:p>
         </w:tc>
@@ -621,81 +1357,200 @@
               <w:rPr>
                 <w:rFonts w:ascii="Calibri" w:hAnsi="Calibri"/>
                 <w:sz w:val="20"/>
-                <w:b w:val="true"/>
-              </w:rPr>
-              <w:t xml:space="default">Number of ADHD medication days supplied</w:t>
-            </w:r>
-          </w:p>
-        </w:tc>
-        <w:tc>
-          <w:tcPr>
-            <w:tcBorders>
-              <w:top w:val="single" w:space="0" w:color="D3D3D3"/>
-              <w:bottom w:val="single" w:space="0" w:color="D3D3D3"/>
-              <w:start w:val="single" w:space="0" w:color="D3D3D3"/>
-              <w:end w:val="single" w:space="0" w:color="D3D3D3"/>
-            </w:tcBorders>
-          </w:tcPr>
-          <w:p>
-            <w:pPr>
-              <w:spacing w:before="0" w:after="60"/>
-              <w:keepNext/>
-              <w:jc w:val="center"/>
-            </w:pPr>
-            <w:r>
-              <w:rPr>
-                <w:rFonts w:ascii="Calibri" w:hAnsi="Calibri"/>
-                <w:sz w:val="20"/>
-              </w:rPr>
-              <w:t xml:space="default">161 (117)</w:t>
-            </w:r>
-          </w:p>
-        </w:tc>
-        <w:tc>
-          <w:tcPr>
-            <w:tcBorders>
-              <w:top w:val="single" w:space="0" w:color="D3D3D3"/>
-              <w:bottom w:val="single" w:space="0" w:color="D3D3D3"/>
-              <w:start w:val="single" w:space="0" w:color="D3D3D3"/>
-              <w:end w:val="single" w:space="0" w:color="D3D3D3"/>
-            </w:tcBorders>
-          </w:tcPr>
-          <w:p>
-            <w:pPr>
-              <w:spacing w:before="0" w:after="60"/>
-              <w:keepNext/>
-              <w:jc w:val="center"/>
-            </w:pPr>
-            <w:r>
-              <w:rPr>
-                <w:rFonts w:ascii="Calibri" w:hAnsi="Calibri"/>
-                <w:sz w:val="20"/>
-              </w:rPr>
-              <w:t xml:space="default">164 (141)</w:t>
-            </w:r>
-          </w:p>
-        </w:tc>
-        <w:tc>
-          <w:tcPr>
-            <w:tcBorders>
-              <w:top w:val="single" w:space="0" w:color="D3D3D3"/>
-              <w:bottom w:val="single" w:space="0" w:color="D3D3D3"/>
-              <w:start w:val="single" w:space="0" w:color="D3D3D3"/>
-              <w:end w:val="single" w:space="0" w:color="D3D3D3"/>
-            </w:tcBorders>
-          </w:tcPr>
-          <w:p>
-            <w:pPr>
-              <w:spacing w:before="0" w:after="60"/>
-              <w:keepNext/>
-              <w:jc w:val="center"/>
-            </w:pPr>
-            <w:r>
-              <w:rPr>
-                <w:rFonts w:ascii="Calibri" w:hAnsi="Calibri"/>
-                <w:sz w:val="20"/>
-              </w:rPr>
-              <w:t xml:space="default">0.8</w:t>
+              </w:rPr>
+              <w:t xml:space="default">    3</w:t>
+            </w:r>
+          </w:p>
+        </w:tc>
+        <w:tc>
+          <w:tcPr>
+            <w:tcBorders>
+              <w:top w:val="single" w:space="0" w:color="D3D3D3"/>
+              <w:bottom w:val="single" w:space="0" w:color="D3D3D3"/>
+              <w:start w:val="single" w:space="0" w:color="D3D3D3"/>
+              <w:end w:val="single" w:space="0" w:color="D3D3D3"/>
+            </w:tcBorders>
+          </w:tcPr>
+          <w:p>
+            <w:pPr>
+              <w:spacing w:before="0" w:after="60"/>
+              <w:keepNext/>
+              <w:jc w:val="center"/>
+            </w:pPr>
+            <w:r>
+              <w:rPr>
+                <w:rFonts w:ascii="Calibri" w:hAnsi="Calibri"/>
+                <w:sz w:val="20"/>
+              </w:rPr>
+              <w:t xml:space="default">2,714 (&lt;0.1%)</w:t>
+            </w:r>
+          </w:p>
+        </w:tc>
+        <w:tc>
+          <w:tcPr>
+            <w:tcBorders>
+              <w:top w:val="single" w:space="0" w:color="D3D3D3"/>
+              <w:bottom w:val="single" w:space="0" w:color="D3D3D3"/>
+              <w:start w:val="single" w:space="0" w:color="D3D3D3"/>
+              <w:end w:val="single" w:space="0" w:color="D3D3D3"/>
+            </w:tcBorders>
+          </w:tcPr>
+          <w:p>
+            <w:pPr>
+              <w:spacing w:before="0" w:after="60"/>
+              <w:keepNext/>
+              <w:jc w:val="center"/>
+            </w:pPr>
+            <w:r>
+              <w:rPr>
+                <w:rFonts w:ascii="Calibri" w:hAnsi="Calibri"/>
+                <w:sz w:val="20"/>
+              </w:rPr>
+              <w:t xml:space="default">16,553 (0.3%)</w:t>
+            </w:r>
+          </w:p>
+        </w:tc>
+        <w:tc>
+          <w:tcPr>
+            <w:tcBorders>
+              <w:top w:val="single" w:space="0" w:color="D3D3D3"/>
+              <w:bottom w:val="single" w:space="0" w:color="D3D3D3"/>
+              <w:start w:val="single" w:space="0" w:color="D3D3D3"/>
+              <w:end w:val="single" w:space="0" w:color="D3D3D3"/>
+            </w:tcBorders>
+          </w:tcPr>
+          <w:p>
+            <w:pPr>
+              <w:spacing w:before="0" w:after="60"/>
+              <w:keepNext/>
+              <w:jc w:val="center"/>
+            </w:pPr>
+            <w:r>
+              <w:rPr>
+                <w:rFonts w:ascii="Calibri" w:hAnsi="Calibri"/>
+                <w:sz w:val="20"/>
+              </w:rPr>
+              <w:t xml:space="default">21,712 (0.3%)</w:t>
+            </w:r>
+          </w:p>
+        </w:tc>
+        <w:tc>
+          <w:tcPr>
+            <w:tcBorders>
+              <w:top w:val="single" w:space="0" w:color="D3D3D3"/>
+              <w:bottom w:val="single" w:space="0" w:color="D3D3D3"/>
+              <w:start w:val="single" w:space="0" w:color="D3D3D3"/>
+              <w:end w:val="single" w:space="0" w:color="D3D3D3"/>
+            </w:tcBorders>
+          </w:tcPr>
+          <w:p>
+            <w:pPr>
+              <w:spacing w:before="0" w:after="60"/>
+              <w:keepNext/>
+              <w:jc w:val="center"/>
+            </w:pPr>
+            <w:r>
+              <w:rPr>
+                <w:rFonts w:ascii="Calibri" w:hAnsi="Calibri"/>
+                <w:sz w:val="20"/>
+              </w:rPr>
+              <w:t xml:space="default">14,880 (0.2%)</w:t>
+            </w:r>
+          </w:p>
+        </w:tc>
+        <w:tc>
+          <w:tcPr>
+            <w:tcBorders>
+              <w:top w:val="single" w:space="0" w:color="D3D3D3"/>
+              <w:bottom w:val="single" w:space="0" w:color="D3D3D3"/>
+              <w:start w:val="single" w:space="0" w:color="D3D3D3"/>
+              <w:end w:val="single" w:space="0" w:color="D3D3D3"/>
+            </w:tcBorders>
+          </w:tcPr>
+          <w:p>
+            <w:pPr>
+              <w:spacing w:before="0" w:after="60"/>
+              <w:keepNext/>
+              <w:jc w:val="center"/>
+            </w:pPr>
+            <w:r>
+              <w:rPr>
+                <w:rFonts w:ascii="Calibri" w:hAnsi="Calibri"/>
+                <w:sz w:val="20"/>
+              </w:rPr>
+              <w:t xml:space="default">26,204 (0.4%)</w:t>
+            </w:r>
+          </w:p>
+        </w:tc>
+        <w:tc>
+          <w:tcPr>
+            <w:tcBorders>
+              <w:top w:val="single" w:space="0" w:color="D3D3D3"/>
+              <w:bottom w:val="single" w:space="0" w:color="D3D3D3"/>
+              <w:start w:val="single" w:space="0" w:color="D3D3D3"/>
+              <w:end w:val="single" w:space="0" w:color="D3D3D3"/>
+            </w:tcBorders>
+          </w:tcPr>
+          <w:p>
+            <w:pPr>
+              <w:spacing w:before="0" w:after="60"/>
+              <w:keepNext/>
+              <w:jc w:val="center"/>
+            </w:pPr>
+            <w:r>
+              <w:rPr>
+                <w:rFonts w:ascii="Calibri" w:hAnsi="Calibri"/>
+                <w:sz w:val="20"/>
+              </w:rPr>
+              <w:t xml:space="default">20,340 (0.3%)</w:t>
+            </w:r>
+          </w:p>
+        </w:tc>
+        <w:tc>
+          <w:tcPr>
+            <w:tcBorders>
+              <w:top w:val="single" w:space="0" w:color="D3D3D3"/>
+              <w:bottom w:val="single" w:space="0" w:color="D3D3D3"/>
+              <w:start w:val="single" w:space="0" w:color="D3D3D3"/>
+              <w:end w:val="single" w:space="0" w:color="D3D3D3"/>
+            </w:tcBorders>
+          </w:tcPr>
+          <w:p>
+            <w:pPr>
+              <w:spacing w:before="0" w:after="60"/>
+              <w:keepNext/>
+              <w:jc w:val="center"/>
+            </w:pPr>
+            <w:r>
+              <w:rPr>
+                <w:rFonts w:ascii="Calibri" w:hAnsi="Calibri"/>
+                <w:sz w:val="20"/>
+              </w:rPr>
+              <w:t xml:space="default">0 (0%)</w:t>
+            </w:r>
+          </w:p>
+        </w:tc>
+        <w:tc>
+          <w:tcPr>
+            <w:tcBorders>
+              <w:top w:val="single" w:space="0" w:color="D3D3D3"/>
+              <w:bottom w:val="single" w:space="0" w:color="D3D3D3"/>
+              <w:start w:val="single" w:space="0" w:color="D3D3D3"/>
+              <w:end w:val="single" w:space="0" w:color="D3D3D3"/>
+            </w:tcBorders>
+          </w:tcPr>
+          <w:p>
+            <w:pPr>
+              <w:spacing w:before="0" w:after="60"/>
+              <w:keepNext/>
+              <w:jc w:val="center"/>
+            </w:pPr>
+            <w:r>
+              <w:rPr>
+                <w:rFonts w:ascii="Calibri" w:hAnsi="Calibri"/>
+                <w:sz w:val="20"/>
+              </w:rPr>
+              <w:t xml:space="default"/>
             </w:r>
           </w:p>
         </w:tc>
@@ -725,79 +1580,199 @@
                 <w:sz w:val="20"/>
                 <w:b w:val="true"/>
               </w:rPr>
-              <w:t xml:space="default">Average number of pills per fill</w:t>
-            </w:r>
-          </w:p>
-        </w:tc>
-        <w:tc>
-          <w:tcPr>
-            <w:tcBorders>
-              <w:top w:val="single" w:space="0" w:color="D3D3D3"/>
-              <w:bottom w:val="single" w:space="0" w:color="D3D3D3"/>
-              <w:start w:val="single" w:space="0" w:color="D3D3D3"/>
-              <w:end w:val="single" w:space="0" w:color="D3D3D3"/>
-            </w:tcBorders>
-          </w:tcPr>
-          <w:p>
-            <w:pPr>
-              <w:spacing w:before="0" w:after="60"/>
-              <w:keepNext/>
-              <w:jc w:val="center"/>
-            </w:pPr>
-            <w:r>
-              <w:rPr>
-                <w:rFonts w:ascii="Calibri" w:hAnsi="Calibri"/>
-                <w:sz w:val="20"/>
-              </w:rPr>
-              <w:t xml:space="default">45 (28)</w:t>
-            </w:r>
-          </w:p>
-        </w:tc>
-        <w:tc>
-          <w:tcPr>
-            <w:tcBorders>
-              <w:top w:val="single" w:space="0" w:color="D3D3D3"/>
-              <w:bottom w:val="single" w:space="0" w:color="D3D3D3"/>
-              <w:start w:val="single" w:space="0" w:color="D3D3D3"/>
-              <w:end w:val="single" w:space="0" w:color="D3D3D3"/>
-            </w:tcBorders>
-          </w:tcPr>
-          <w:p>
-            <w:pPr>
-              <w:spacing w:before="0" w:after="60"/>
-              <w:keepNext/>
-              <w:jc w:val="center"/>
-            </w:pPr>
-            <w:r>
-              <w:rPr>
-                <w:rFonts w:ascii="Calibri" w:hAnsi="Calibri"/>
-                <w:sz w:val="20"/>
-              </w:rPr>
-              <w:t xml:space="default">44 (29)</w:t>
-            </w:r>
-          </w:p>
-        </w:tc>
-        <w:tc>
-          <w:tcPr>
-            <w:tcBorders>
-              <w:top w:val="single" w:space="0" w:color="D3D3D3"/>
-              <w:bottom w:val="single" w:space="0" w:color="D3D3D3"/>
-              <w:start w:val="single" w:space="0" w:color="D3D3D3"/>
-              <w:end w:val="single" w:space="0" w:color="D3D3D3"/>
-            </w:tcBorders>
-          </w:tcPr>
-          <w:p>
-            <w:pPr>
-              <w:spacing w:before="0" w:after="60"/>
-              <w:keepNext/>
-              <w:jc w:val="center"/>
-            </w:pPr>
-            <w:r>
-              <w:rPr>
-                <w:rFonts w:ascii="Calibri" w:hAnsi="Calibri"/>
-                <w:sz w:val="20"/>
-              </w:rPr>
-              <w:t xml:space="default">0.6</w:t>
+              <w:t xml:space="default">Number of stimulant medication fills</w:t>
+            </w:r>
+          </w:p>
+        </w:tc>
+        <w:tc>
+          <w:tcPr>
+            <w:tcBorders>
+              <w:top w:val="single" w:space="0" w:color="D3D3D3"/>
+              <w:bottom w:val="single" w:space="0" w:color="D3D3D3"/>
+              <w:start w:val="single" w:space="0" w:color="D3D3D3"/>
+              <w:end w:val="single" w:space="0" w:color="D3D3D3"/>
+            </w:tcBorders>
+          </w:tcPr>
+          <w:p>
+            <w:pPr>
+              <w:spacing w:before="0" w:after="60"/>
+              <w:keepNext/>
+              <w:jc w:val="center"/>
+            </w:pPr>
+            <w:r>
+              <w:rPr>
+                <w:rFonts w:ascii="Calibri" w:hAnsi="Calibri"/>
+                <w:sz w:val="20"/>
+              </w:rPr>
+              <w:t xml:space="default">7.13 (4.61)</w:t>
+            </w:r>
+          </w:p>
+        </w:tc>
+        <w:tc>
+          <w:tcPr>
+            <w:tcBorders>
+              <w:top w:val="single" w:space="0" w:color="D3D3D3"/>
+              <w:bottom w:val="single" w:space="0" w:color="D3D3D3"/>
+              <w:start w:val="single" w:space="0" w:color="D3D3D3"/>
+              <w:end w:val="single" w:space="0" w:color="D3D3D3"/>
+            </w:tcBorders>
+          </w:tcPr>
+          <w:p>
+            <w:pPr>
+              <w:spacing w:before="0" w:after="60"/>
+              <w:keepNext/>
+              <w:jc w:val="center"/>
+            </w:pPr>
+            <w:r>
+              <w:rPr>
+                <w:rFonts w:ascii="Calibri" w:hAnsi="Calibri"/>
+                <w:sz w:val="20"/>
+              </w:rPr>
+              <w:t xml:space="default">7.19 (4.74)</w:t>
+            </w:r>
+          </w:p>
+        </w:tc>
+        <w:tc>
+          <w:tcPr>
+            <w:tcBorders>
+              <w:top w:val="single" w:space="0" w:color="D3D3D3"/>
+              <w:bottom w:val="single" w:space="0" w:color="D3D3D3"/>
+              <w:start w:val="single" w:space="0" w:color="D3D3D3"/>
+              <w:end w:val="single" w:space="0" w:color="D3D3D3"/>
+            </w:tcBorders>
+          </w:tcPr>
+          <w:p>
+            <w:pPr>
+              <w:spacing w:before="0" w:after="60"/>
+              <w:keepNext/>
+              <w:jc w:val="center"/>
+            </w:pPr>
+            <w:r>
+              <w:rPr>
+                <w:rFonts w:ascii="Calibri" w:hAnsi="Calibri"/>
+                <w:sz w:val="20"/>
+              </w:rPr>
+              <w:t xml:space="default">7.08 (4.77)</w:t>
+            </w:r>
+          </w:p>
+        </w:tc>
+        <w:tc>
+          <w:tcPr>
+            <w:tcBorders>
+              <w:top w:val="single" w:space="0" w:color="D3D3D3"/>
+              <w:bottom w:val="single" w:space="0" w:color="D3D3D3"/>
+              <w:start w:val="single" w:space="0" w:color="D3D3D3"/>
+              <w:end w:val="single" w:space="0" w:color="D3D3D3"/>
+            </w:tcBorders>
+          </w:tcPr>
+          <w:p>
+            <w:pPr>
+              <w:spacing w:before="0" w:after="60"/>
+              <w:keepNext/>
+              <w:jc w:val="center"/>
+            </w:pPr>
+            <w:r>
+              <w:rPr>
+                <w:rFonts w:ascii="Calibri" w:hAnsi="Calibri"/>
+                <w:sz w:val="20"/>
+              </w:rPr>
+              <w:t xml:space="default">7.04 (4.85)</w:t>
+            </w:r>
+          </w:p>
+        </w:tc>
+        <w:tc>
+          <w:tcPr>
+            <w:tcBorders>
+              <w:top w:val="single" w:space="0" w:color="D3D3D3"/>
+              <w:bottom w:val="single" w:space="0" w:color="D3D3D3"/>
+              <w:start w:val="single" w:space="0" w:color="D3D3D3"/>
+              <w:end w:val="single" w:space="0" w:color="D3D3D3"/>
+            </w:tcBorders>
+          </w:tcPr>
+          <w:p>
+            <w:pPr>
+              <w:spacing w:before="0" w:after="60"/>
+              <w:keepNext/>
+              <w:jc w:val="center"/>
+            </w:pPr>
+            <w:r>
+              <w:rPr>
+                <w:rFonts w:ascii="Calibri" w:hAnsi="Calibri"/>
+                <w:sz w:val="20"/>
+              </w:rPr>
+              <w:t xml:space="default">7.74 (5.34)</w:t>
+            </w:r>
+          </w:p>
+        </w:tc>
+        <w:tc>
+          <w:tcPr>
+            <w:tcBorders>
+              <w:top w:val="single" w:space="0" w:color="D3D3D3"/>
+              <w:bottom w:val="single" w:space="0" w:color="D3D3D3"/>
+              <w:start w:val="single" w:space="0" w:color="D3D3D3"/>
+              <w:end w:val="single" w:space="0" w:color="D3D3D3"/>
+            </w:tcBorders>
+          </w:tcPr>
+          <w:p>
+            <w:pPr>
+              <w:spacing w:before="0" w:after="60"/>
+              <w:keepNext/>
+              <w:jc w:val="center"/>
+            </w:pPr>
+            <w:r>
+              <w:rPr>
+                <w:rFonts w:ascii="Calibri" w:hAnsi="Calibri"/>
+                <w:sz w:val="20"/>
+              </w:rPr>
+              <w:t xml:space="default">7.66 (4.68)</w:t>
+            </w:r>
+          </w:p>
+        </w:tc>
+        <w:tc>
+          <w:tcPr>
+            <w:tcBorders>
+              <w:top w:val="single" w:space="0" w:color="D3D3D3"/>
+              <w:bottom w:val="single" w:space="0" w:color="D3D3D3"/>
+              <w:start w:val="single" w:space="0" w:color="D3D3D3"/>
+              <w:end w:val="single" w:space="0" w:color="D3D3D3"/>
+            </w:tcBorders>
+          </w:tcPr>
+          <w:p>
+            <w:pPr>
+              <w:spacing w:before="0" w:after="60"/>
+              <w:keepNext/>
+              <w:jc w:val="center"/>
+            </w:pPr>
+            <w:r>
+              <w:rPr>
+                <w:rFonts w:ascii="Calibri" w:hAnsi="Calibri"/>
+                <w:sz w:val="20"/>
+              </w:rPr>
+              <w:t xml:space="default">6.78 (4.62)</w:t>
+            </w:r>
+          </w:p>
+        </w:tc>
+        <w:tc>
+          <w:tcPr>
+            <w:tcBorders>
+              <w:top w:val="single" w:space="0" w:color="D3D3D3"/>
+              <w:bottom w:val="single" w:space="0" w:color="D3D3D3"/>
+              <w:start w:val="single" w:space="0" w:color="D3D3D3"/>
+              <w:end w:val="single" w:space="0" w:color="D3D3D3"/>
+            </w:tcBorders>
+          </w:tcPr>
+          <w:p>
+            <w:pPr>
+              <w:spacing w:before="0" w:after="60"/>
+              <w:keepNext/>
+              <w:jc w:val="center"/>
+            </w:pPr>
+            <w:r>
+              <w:rPr>
+                <w:rFonts w:ascii="Calibri" w:hAnsi="Calibri"/>
+                <w:sz w:val="20"/>
+              </w:rPr>
+              <w:t xml:space="default">0.067</w:t>
             </w:r>
           </w:p>
         </w:tc>
@@ -827,79 +1802,199 @@
                 <w:sz w:val="20"/>
                 <w:b w:val="true"/>
               </w:rPr>
-              <w:t xml:space="default">Total ADHD medication spending (2021 USD)</w:t>
-            </w:r>
-          </w:p>
-        </w:tc>
-        <w:tc>
-          <w:tcPr>
-            <w:tcBorders>
-              <w:top w:val="single" w:space="0" w:color="D3D3D3"/>
-              <w:bottom w:val="single" w:space="0" w:color="D3D3D3"/>
-              <w:start w:val="single" w:space="0" w:color="D3D3D3"/>
-              <w:end w:val="single" w:space="0" w:color="D3D3D3"/>
-            </w:tcBorders>
-          </w:tcPr>
-          <w:p>
-            <w:pPr>
-              <w:spacing w:before="0" w:after="60"/>
-              <w:keepNext/>
-              <w:jc w:val="center"/>
-            </w:pPr>
-            <w:r>
-              <w:rPr>
-                <w:rFonts w:ascii="Calibri" w:hAnsi="Calibri"/>
-                <w:sz w:val="20"/>
-              </w:rPr>
-              <w:t xml:space="default">765 (1,322)</w:t>
-            </w:r>
-          </w:p>
-        </w:tc>
-        <w:tc>
-          <w:tcPr>
-            <w:tcBorders>
-              <w:top w:val="single" w:space="0" w:color="D3D3D3"/>
-              <w:bottom w:val="single" w:space="0" w:color="D3D3D3"/>
-              <w:start w:val="single" w:space="0" w:color="D3D3D3"/>
-              <w:end w:val="single" w:space="0" w:color="D3D3D3"/>
-            </w:tcBorders>
-          </w:tcPr>
-          <w:p>
-            <w:pPr>
-              <w:spacing w:before="0" w:after="60"/>
-              <w:keepNext/>
-              <w:jc w:val="center"/>
-            </w:pPr>
-            <w:r>
-              <w:rPr>
-                <w:rFonts w:ascii="Calibri" w:hAnsi="Calibri"/>
-                <w:sz w:val="20"/>
-              </w:rPr>
-              <w:t xml:space="default">797 (2,204)</w:t>
-            </w:r>
-          </w:p>
-        </w:tc>
-        <w:tc>
-          <w:tcPr>
-            <w:tcBorders>
-              <w:top w:val="single" w:space="0" w:color="D3D3D3"/>
-              <w:bottom w:val="single" w:space="0" w:color="D3D3D3"/>
-              <w:start w:val="single" w:space="0" w:color="D3D3D3"/>
-              <w:end w:val="single" w:space="0" w:color="D3D3D3"/>
-            </w:tcBorders>
-          </w:tcPr>
-          <w:p>
-            <w:pPr>
-              <w:spacing w:before="0" w:after="60"/>
-              <w:keepNext/>
-              <w:jc w:val="center"/>
-            </w:pPr>
-            <w:r>
-              <w:rPr>
-                <w:rFonts w:ascii="Calibri" w:hAnsi="Calibri"/>
-                <w:sz w:val="20"/>
-              </w:rPr>
-              <w:t xml:space="default">0.077</w:t>
+              <w:t xml:space="default">Number of stimulant medication days supplied</w:t>
+            </w:r>
+          </w:p>
+        </w:tc>
+        <w:tc>
+          <w:tcPr>
+            <w:tcBorders>
+              <w:top w:val="single" w:space="0" w:color="D3D3D3"/>
+              <w:bottom w:val="single" w:space="0" w:color="D3D3D3"/>
+              <w:start w:val="single" w:space="0" w:color="D3D3D3"/>
+              <w:end w:val="single" w:space="0" w:color="D3D3D3"/>
+            </w:tcBorders>
+          </w:tcPr>
+          <w:p>
+            <w:pPr>
+              <w:spacing w:before="0" w:after="60"/>
+              <w:keepNext/>
+              <w:jc w:val="center"/>
+            </w:pPr>
+            <w:r>
+              <w:rPr>
+                <w:rFonts w:ascii="Calibri" w:hAnsi="Calibri"/>
+                <w:sz w:val="20"/>
+              </w:rPr>
+              <w:t xml:space="default">215.42 (137.09)</w:t>
+            </w:r>
+          </w:p>
+        </w:tc>
+        <w:tc>
+          <w:tcPr>
+            <w:tcBorders>
+              <w:top w:val="single" w:space="0" w:color="D3D3D3"/>
+              <w:bottom w:val="single" w:space="0" w:color="D3D3D3"/>
+              <w:start w:val="single" w:space="0" w:color="D3D3D3"/>
+              <w:end w:val="single" w:space="0" w:color="D3D3D3"/>
+            </w:tcBorders>
+          </w:tcPr>
+          <w:p>
+            <w:pPr>
+              <w:spacing w:before="0" w:after="60"/>
+              <w:keepNext/>
+              <w:jc w:val="center"/>
+            </w:pPr>
+            <w:r>
+              <w:rPr>
+                <w:rFonts w:ascii="Calibri" w:hAnsi="Calibri"/>
+                <w:sz w:val="20"/>
+              </w:rPr>
+              <w:t xml:space="default">212.98 (140.61)</w:t>
+            </w:r>
+          </w:p>
+        </w:tc>
+        <w:tc>
+          <w:tcPr>
+            <w:tcBorders>
+              <w:top w:val="single" w:space="0" w:color="D3D3D3"/>
+              <w:bottom w:val="single" w:space="0" w:color="D3D3D3"/>
+              <w:start w:val="single" w:space="0" w:color="D3D3D3"/>
+              <w:end w:val="single" w:space="0" w:color="D3D3D3"/>
+            </w:tcBorders>
+          </w:tcPr>
+          <w:p>
+            <w:pPr>
+              <w:spacing w:before="0" w:after="60"/>
+              <w:keepNext/>
+              <w:jc w:val="center"/>
+            </w:pPr>
+            <w:r>
+              <w:rPr>
+                <w:rFonts w:ascii="Calibri" w:hAnsi="Calibri"/>
+                <w:sz w:val="20"/>
+              </w:rPr>
+              <w:t xml:space="default">189.56 (125.34)</w:t>
+            </w:r>
+          </w:p>
+        </w:tc>
+        <w:tc>
+          <w:tcPr>
+            <w:tcBorders>
+              <w:top w:val="single" w:space="0" w:color="D3D3D3"/>
+              <w:bottom w:val="single" w:space="0" w:color="D3D3D3"/>
+              <w:start w:val="single" w:space="0" w:color="D3D3D3"/>
+              <w:end w:val="single" w:space="0" w:color="D3D3D3"/>
+            </w:tcBorders>
+          </w:tcPr>
+          <w:p>
+            <w:pPr>
+              <w:spacing w:before="0" w:after="60"/>
+              <w:keepNext/>
+              <w:jc w:val="center"/>
+            </w:pPr>
+            <w:r>
+              <w:rPr>
+                <w:rFonts w:ascii="Calibri" w:hAnsi="Calibri"/>
+                <w:sz w:val="20"/>
+              </w:rPr>
+              <w:t xml:space="default">205.14 (150.92)</w:t>
+            </w:r>
+          </w:p>
+        </w:tc>
+        <w:tc>
+          <w:tcPr>
+            <w:tcBorders>
+              <w:top w:val="single" w:space="0" w:color="D3D3D3"/>
+              <w:bottom w:val="single" w:space="0" w:color="D3D3D3"/>
+              <w:start w:val="single" w:space="0" w:color="D3D3D3"/>
+              <w:end w:val="single" w:space="0" w:color="D3D3D3"/>
+            </w:tcBorders>
+          </w:tcPr>
+          <w:p>
+            <w:pPr>
+              <w:spacing w:before="0" w:after="60"/>
+              <w:keepNext/>
+              <w:jc w:val="center"/>
+            </w:pPr>
+            <w:r>
+              <w:rPr>
+                <w:rFonts w:ascii="Calibri" w:hAnsi="Calibri"/>
+                <w:sz w:val="20"/>
+              </w:rPr>
+              <w:t xml:space="default">214.38 (149.84)</w:t>
+            </w:r>
+          </w:p>
+        </w:tc>
+        <w:tc>
+          <w:tcPr>
+            <w:tcBorders>
+              <w:top w:val="single" w:space="0" w:color="D3D3D3"/>
+              <w:bottom w:val="single" w:space="0" w:color="D3D3D3"/>
+              <w:start w:val="single" w:space="0" w:color="D3D3D3"/>
+              <w:end w:val="single" w:space="0" w:color="D3D3D3"/>
+            </w:tcBorders>
+          </w:tcPr>
+          <w:p>
+            <w:pPr>
+              <w:spacing w:before="0" w:after="60"/>
+              <w:keepNext/>
+              <w:jc w:val="center"/>
+            </w:pPr>
+            <w:r>
+              <w:rPr>
+                <w:rFonts w:ascii="Calibri" w:hAnsi="Calibri"/>
+                <w:sz w:val="20"/>
+              </w:rPr>
+              <w:t xml:space="default">218.67 (139.51)</w:t>
+            </w:r>
+          </w:p>
+        </w:tc>
+        <w:tc>
+          <w:tcPr>
+            <w:tcBorders>
+              <w:top w:val="single" w:space="0" w:color="D3D3D3"/>
+              <w:bottom w:val="single" w:space="0" w:color="D3D3D3"/>
+              <w:start w:val="single" w:space="0" w:color="D3D3D3"/>
+              <w:end w:val="single" w:space="0" w:color="D3D3D3"/>
+            </w:tcBorders>
+          </w:tcPr>
+          <w:p>
+            <w:pPr>
+              <w:spacing w:before="0" w:after="60"/>
+              <w:keepNext/>
+              <w:jc w:val="center"/>
+            </w:pPr>
+            <w:r>
+              <w:rPr>
+                <w:rFonts w:ascii="Calibri" w:hAnsi="Calibri"/>
+                <w:sz w:val="20"/>
+              </w:rPr>
+              <w:t xml:space="default">194.02 (142.07)</w:t>
+            </w:r>
+          </w:p>
+        </w:tc>
+        <w:tc>
+          <w:tcPr>
+            <w:tcBorders>
+              <w:top w:val="single" w:space="0" w:color="D3D3D3"/>
+              <w:bottom w:val="single" w:space="0" w:color="D3D3D3"/>
+              <w:start w:val="single" w:space="0" w:color="D3D3D3"/>
+              <w:end w:val="single" w:space="0" w:color="D3D3D3"/>
+            </w:tcBorders>
+          </w:tcPr>
+          <w:p>
+            <w:pPr>
+              <w:spacing w:before="0" w:after="60"/>
+              <w:keepNext/>
+              <w:jc w:val="center"/>
+            </w:pPr>
+            <w:r>
+              <w:rPr>
+                <w:rFonts w:ascii="Calibri" w:hAnsi="Calibri"/>
+                <w:sz w:val="20"/>
+              </w:rPr>
+              <w:t xml:space="default">0.057</w:t>
             </w:r>
           </w:p>
         </w:tc>
@@ -929,79 +2024,199 @@
                 <w:sz w:val="20"/>
                 <w:b w:val="true"/>
               </w:rPr>
-              <w:t xml:space="default">Out-of-pocket ADHD spending (2021 USD)</w:t>
-            </w:r>
-          </w:p>
-        </w:tc>
-        <w:tc>
-          <w:tcPr>
-            <w:tcBorders>
-              <w:top w:val="single" w:space="0" w:color="D3D3D3"/>
-              <w:bottom w:val="single" w:space="0" w:color="D3D3D3"/>
-              <w:start w:val="single" w:space="0" w:color="D3D3D3"/>
-              <w:end w:val="single" w:space="0" w:color="D3D3D3"/>
-            </w:tcBorders>
-          </w:tcPr>
-          <w:p>
-            <w:pPr>
-              <w:spacing w:before="0" w:after="60"/>
-              <w:keepNext/>
-              <w:jc w:val="center"/>
-            </w:pPr>
-            <w:r>
-              <w:rPr>
-                <w:rFonts w:ascii="Calibri" w:hAnsi="Calibri"/>
-                <w:sz w:val="20"/>
-              </w:rPr>
-              <w:t xml:space="default">120 (284)</w:t>
-            </w:r>
-          </w:p>
-        </w:tc>
-        <w:tc>
-          <w:tcPr>
-            <w:tcBorders>
-              <w:top w:val="single" w:space="0" w:color="D3D3D3"/>
-              <w:bottom w:val="single" w:space="0" w:color="D3D3D3"/>
-              <w:start w:val="single" w:space="0" w:color="D3D3D3"/>
-              <w:end w:val="single" w:space="0" w:color="D3D3D3"/>
-            </w:tcBorders>
-          </w:tcPr>
-          <w:p>
-            <w:pPr>
-              <w:spacing w:before="0" w:after="60"/>
-              <w:keepNext/>
-              <w:jc w:val="center"/>
-            </w:pPr>
-            <w:r>
-              <w:rPr>
-                <w:rFonts w:ascii="Calibri" w:hAnsi="Calibri"/>
-                <w:sz w:val="20"/>
-              </w:rPr>
-              <w:t xml:space="default">134 (326)</w:t>
-            </w:r>
-          </w:p>
-        </w:tc>
-        <w:tc>
-          <w:tcPr>
-            <w:tcBorders>
-              <w:top w:val="single" w:space="0" w:color="D3D3D3"/>
-              <w:bottom w:val="single" w:space="0" w:color="D3D3D3"/>
-              <w:start w:val="single" w:space="0" w:color="D3D3D3"/>
-              <w:end w:val="single" w:space="0" w:color="D3D3D3"/>
-            </w:tcBorders>
-          </w:tcPr>
-          <w:p>
-            <w:pPr>
-              <w:spacing w:before="0" w:after="60"/>
-              <w:keepNext/>
-              <w:jc w:val="center"/>
-            </w:pPr>
-            <w:r>
-              <w:rPr>
-                <w:rFonts w:ascii="Calibri" w:hAnsi="Calibri"/>
-                <w:sz w:val="20"/>
-              </w:rPr>
-              <w:t xml:space="default">0.4</w:t>
+              <w:t xml:space="default">Mean quantity per stimulant medication fill</w:t>
+            </w:r>
+          </w:p>
+        </w:tc>
+        <w:tc>
+          <w:tcPr>
+            <w:tcBorders>
+              <w:top w:val="single" w:space="0" w:color="D3D3D3"/>
+              <w:bottom w:val="single" w:space="0" w:color="D3D3D3"/>
+              <w:start w:val="single" w:space="0" w:color="D3D3D3"/>
+              <w:end w:val="single" w:space="0" w:color="D3D3D3"/>
+            </w:tcBorders>
+          </w:tcPr>
+          <w:p>
+            <w:pPr>
+              <w:spacing w:before="0" w:after="60"/>
+              <w:keepNext/>
+              <w:jc w:val="center"/>
+            </w:pPr>
+            <w:r>
+              <w:rPr>
+                <w:rFonts w:ascii="Calibri" w:hAnsi="Calibri"/>
+                <w:sz w:val="20"/>
+              </w:rPr>
+              <w:t xml:space="default">44.37 (30.94)</w:t>
+            </w:r>
+          </w:p>
+        </w:tc>
+        <w:tc>
+          <w:tcPr>
+            <w:tcBorders>
+              <w:top w:val="single" w:space="0" w:color="D3D3D3"/>
+              <w:bottom w:val="single" w:space="0" w:color="D3D3D3"/>
+              <w:start w:val="single" w:space="0" w:color="D3D3D3"/>
+              <w:end w:val="single" w:space="0" w:color="D3D3D3"/>
+            </w:tcBorders>
+          </w:tcPr>
+          <w:p>
+            <w:pPr>
+              <w:spacing w:before="0" w:after="60"/>
+              <w:keepNext/>
+              <w:jc w:val="center"/>
+            </w:pPr>
+            <w:r>
+              <w:rPr>
+                <w:rFonts w:ascii="Calibri" w:hAnsi="Calibri"/>
+                <w:sz w:val="20"/>
+              </w:rPr>
+              <w:t xml:space="default">43.03 (30.21)</w:t>
+            </w:r>
+          </w:p>
+        </w:tc>
+        <w:tc>
+          <w:tcPr>
+            <w:tcBorders>
+              <w:top w:val="single" w:space="0" w:color="D3D3D3"/>
+              <w:bottom w:val="single" w:space="0" w:color="D3D3D3"/>
+              <w:start w:val="single" w:space="0" w:color="D3D3D3"/>
+              <w:end w:val="single" w:space="0" w:color="D3D3D3"/>
+            </w:tcBorders>
+          </w:tcPr>
+          <w:p>
+            <w:pPr>
+              <w:spacing w:before="0" w:after="60"/>
+              <w:keepNext/>
+              <w:jc w:val="center"/>
+            </w:pPr>
+            <w:r>
+              <w:rPr>
+                <w:rFonts w:ascii="Calibri" w:hAnsi="Calibri"/>
+                <w:sz w:val="20"/>
+              </w:rPr>
+              <w:t xml:space="default">43.24 (33.78)</w:t>
+            </w:r>
+          </w:p>
+        </w:tc>
+        <w:tc>
+          <w:tcPr>
+            <w:tcBorders>
+              <w:top w:val="single" w:space="0" w:color="D3D3D3"/>
+              <w:bottom w:val="single" w:space="0" w:color="D3D3D3"/>
+              <w:start w:val="single" w:space="0" w:color="D3D3D3"/>
+              <w:end w:val="single" w:space="0" w:color="D3D3D3"/>
+            </w:tcBorders>
+          </w:tcPr>
+          <w:p>
+            <w:pPr>
+              <w:spacing w:before="0" w:after="60"/>
+              <w:keepNext/>
+              <w:jc w:val="center"/>
+            </w:pPr>
+            <w:r>
+              <w:rPr>
+                <w:rFonts w:ascii="Calibri" w:hAnsi="Calibri"/>
+                <w:sz w:val="20"/>
+              </w:rPr>
+              <w:t xml:space="default">42.59 (31.60)</w:t>
+            </w:r>
+          </w:p>
+        </w:tc>
+        <w:tc>
+          <w:tcPr>
+            <w:tcBorders>
+              <w:top w:val="single" w:space="0" w:color="D3D3D3"/>
+              <w:bottom w:val="single" w:space="0" w:color="D3D3D3"/>
+              <w:start w:val="single" w:space="0" w:color="D3D3D3"/>
+              <w:end w:val="single" w:space="0" w:color="D3D3D3"/>
+            </w:tcBorders>
+          </w:tcPr>
+          <w:p>
+            <w:pPr>
+              <w:spacing w:before="0" w:after="60"/>
+              <w:keepNext/>
+              <w:jc w:val="center"/>
+            </w:pPr>
+            <w:r>
+              <w:rPr>
+                <w:rFonts w:ascii="Calibri" w:hAnsi="Calibri"/>
+                <w:sz w:val="20"/>
+              </w:rPr>
+              <w:t xml:space="default">43.75 (30.73)</w:t>
+            </w:r>
+          </w:p>
+        </w:tc>
+        <w:tc>
+          <w:tcPr>
+            <w:tcBorders>
+              <w:top w:val="single" w:space="0" w:color="D3D3D3"/>
+              <w:bottom w:val="single" w:space="0" w:color="D3D3D3"/>
+              <w:start w:val="single" w:space="0" w:color="D3D3D3"/>
+              <w:end w:val="single" w:space="0" w:color="D3D3D3"/>
+            </w:tcBorders>
+          </w:tcPr>
+          <w:p>
+            <w:pPr>
+              <w:spacing w:before="0" w:after="60"/>
+              <w:keepNext/>
+              <w:jc w:val="center"/>
+            </w:pPr>
+            <w:r>
+              <w:rPr>
+                <w:rFonts w:ascii="Calibri" w:hAnsi="Calibri"/>
+                <w:sz w:val="20"/>
+              </w:rPr>
+              <w:t xml:space="default">40.65 (26.63)</w:t>
+            </w:r>
+          </w:p>
+        </w:tc>
+        <w:tc>
+          <w:tcPr>
+            <w:tcBorders>
+              <w:top w:val="single" w:space="0" w:color="D3D3D3"/>
+              <w:bottom w:val="single" w:space="0" w:color="D3D3D3"/>
+              <w:start w:val="single" w:space="0" w:color="D3D3D3"/>
+              <w:end w:val="single" w:space="0" w:color="D3D3D3"/>
+            </w:tcBorders>
+          </w:tcPr>
+          <w:p>
+            <w:pPr>
+              <w:spacing w:before="0" w:after="60"/>
+              <w:keepNext/>
+              <w:jc w:val="center"/>
+            </w:pPr>
+            <w:r>
+              <w:rPr>
+                <w:rFonts w:ascii="Calibri" w:hAnsi="Calibri"/>
+                <w:sz w:val="20"/>
+              </w:rPr>
+              <w:t xml:space="default">40.13 (31.03)</w:t>
+            </w:r>
+          </w:p>
+        </w:tc>
+        <w:tc>
+          <w:tcPr>
+            <w:tcBorders>
+              <w:top w:val="single" w:space="0" w:color="D3D3D3"/>
+              <w:bottom w:val="single" w:space="0" w:color="D3D3D3"/>
+              <w:start w:val="single" w:space="0" w:color="D3D3D3"/>
+              <w:end w:val="single" w:space="0" w:color="D3D3D3"/>
+            </w:tcBorders>
+          </w:tcPr>
+          <w:p>
+            <w:pPr>
+              <w:spacing w:before="0" w:after="60"/>
+              <w:keepNext/>
+              <w:jc w:val="center"/>
+            </w:pPr>
+            <w:r>
+              <w:rPr>
+                <w:rFonts w:ascii="Calibri" w:hAnsi="Calibri"/>
+                <w:sz w:val="20"/>
+              </w:rPr>
+              <w:t xml:space="default">0.004</w:t>
             </w:r>
           </w:p>
         </w:tc>
@@ -1031,79 +2246,199 @@
                 <w:sz w:val="20"/>
                 <w:b w:val="true"/>
               </w:rPr>
-              <w:t xml:space="default">Private insurance ADHD spending (2021 USD)</w:t>
-            </w:r>
-          </w:p>
-        </w:tc>
-        <w:tc>
-          <w:tcPr>
-            <w:tcBorders>
-              <w:top w:val="single" w:space="0" w:color="D3D3D3"/>
-              <w:bottom w:val="single" w:space="0" w:color="D3D3D3"/>
-              <w:start w:val="single" w:space="0" w:color="D3D3D3"/>
-              <w:end w:val="single" w:space="0" w:color="D3D3D3"/>
-            </w:tcBorders>
-          </w:tcPr>
-          <w:p>
-            <w:pPr>
-              <w:spacing w:before="0" w:after="60"/>
-              <w:keepNext/>
-              <w:jc w:val="center"/>
-            </w:pPr>
-            <w:r>
-              <w:rPr>
-                <w:rFonts w:ascii="Calibri" w:hAnsi="Calibri"/>
-                <w:sz w:val="20"/>
-              </w:rPr>
-              <w:t xml:space="default">247 (612)</w:t>
-            </w:r>
-          </w:p>
-        </w:tc>
-        <w:tc>
-          <w:tcPr>
-            <w:tcBorders>
-              <w:top w:val="single" w:space="0" w:color="D3D3D3"/>
-              <w:bottom w:val="single" w:space="0" w:color="D3D3D3"/>
-              <w:start w:val="single" w:space="0" w:color="D3D3D3"/>
-              <w:end w:val="single" w:space="0" w:color="D3D3D3"/>
-            </w:tcBorders>
-          </w:tcPr>
-          <w:p>
-            <w:pPr>
-              <w:spacing w:before="0" w:after="60"/>
-              <w:keepNext/>
-              <w:jc w:val="center"/>
-            </w:pPr>
-            <w:r>
-              <w:rPr>
-                <w:rFonts w:ascii="Calibri" w:hAnsi="Calibri"/>
-                <w:sz w:val="20"/>
-              </w:rPr>
-              <w:t xml:space="default">104 (473)</w:t>
-            </w:r>
-          </w:p>
-        </w:tc>
-        <w:tc>
-          <w:tcPr>
-            <w:tcBorders>
-              <w:top w:val="single" w:space="0" w:color="D3D3D3"/>
-              <w:bottom w:val="single" w:space="0" w:color="D3D3D3"/>
-              <w:start w:val="single" w:space="0" w:color="D3D3D3"/>
-              <w:end w:val="single" w:space="0" w:color="D3D3D3"/>
-            </w:tcBorders>
-          </w:tcPr>
-          <w:p>
-            <w:pPr>
-              <w:spacing w:before="0" w:after="60"/>
-              <w:keepNext/>
-              <w:jc w:val="center"/>
-            </w:pPr>
-            <w:r>
-              <w:rPr>
-                <w:rFonts w:ascii="Calibri" w:hAnsi="Calibri"/>
-                <w:sz w:val="20"/>
-              </w:rPr>
-              <w:t xml:space="default">0.059</w:t>
+              <w:t xml:space="default">Total expenditure on stimulant medications (2023 USD)</w:t>
+            </w:r>
+          </w:p>
+        </w:tc>
+        <w:tc>
+          <w:tcPr>
+            <w:tcBorders>
+              <w:top w:val="single" w:space="0" w:color="D3D3D3"/>
+              <w:bottom w:val="single" w:space="0" w:color="D3D3D3"/>
+              <w:start w:val="single" w:space="0" w:color="D3D3D3"/>
+              <w:end w:val="single" w:space="0" w:color="D3D3D3"/>
+            </w:tcBorders>
+          </w:tcPr>
+          <w:p>
+            <w:pPr>
+              <w:spacing w:before="0" w:after="60"/>
+              <w:keepNext/>
+              <w:jc w:val="center"/>
+            </w:pPr>
+            <w:r>
+              <w:rPr>
+                <w:rFonts w:ascii="Calibri" w:hAnsi="Calibri"/>
+                <w:sz w:val="20"/>
+              </w:rPr>
+              <w:t xml:space="default">1,624.88 (1,832.27)</w:t>
+            </w:r>
+          </w:p>
+        </w:tc>
+        <w:tc>
+          <w:tcPr>
+            <w:tcBorders>
+              <w:top w:val="single" w:space="0" w:color="D3D3D3"/>
+              <w:bottom w:val="single" w:space="0" w:color="D3D3D3"/>
+              <w:start w:val="single" w:space="0" w:color="D3D3D3"/>
+              <w:end w:val="single" w:space="0" w:color="D3D3D3"/>
+            </w:tcBorders>
+          </w:tcPr>
+          <w:p>
+            <w:pPr>
+              <w:spacing w:before="0" w:after="60"/>
+              <w:keepNext/>
+              <w:jc w:val="center"/>
+            </w:pPr>
+            <w:r>
+              <w:rPr>
+                <w:rFonts w:ascii="Calibri" w:hAnsi="Calibri"/>
+                <w:sz w:val="20"/>
+              </w:rPr>
+              <w:t xml:space="default">1,853.92 (2,036.57)</w:t>
+            </w:r>
+          </w:p>
+        </w:tc>
+        <w:tc>
+          <w:tcPr>
+            <w:tcBorders>
+              <w:top w:val="single" w:space="0" w:color="D3D3D3"/>
+              <w:bottom w:val="single" w:space="0" w:color="D3D3D3"/>
+              <w:start w:val="single" w:space="0" w:color="D3D3D3"/>
+              <w:end w:val="single" w:space="0" w:color="D3D3D3"/>
+            </w:tcBorders>
+          </w:tcPr>
+          <w:p>
+            <w:pPr>
+              <w:spacing w:before="0" w:after="60"/>
+              <w:keepNext/>
+              <w:jc w:val="center"/>
+            </w:pPr>
+            <w:r>
+              <w:rPr>
+                <w:rFonts w:ascii="Calibri" w:hAnsi="Calibri"/>
+                <w:sz w:val="20"/>
+              </w:rPr>
+              <w:t xml:space="default">1,744.79 (2,045.19)</w:t>
+            </w:r>
+          </w:p>
+        </w:tc>
+        <w:tc>
+          <w:tcPr>
+            <w:tcBorders>
+              <w:top w:val="single" w:space="0" w:color="D3D3D3"/>
+              <w:bottom w:val="single" w:space="0" w:color="D3D3D3"/>
+              <w:start w:val="single" w:space="0" w:color="D3D3D3"/>
+              <w:end w:val="single" w:space="0" w:color="D3D3D3"/>
+            </w:tcBorders>
+          </w:tcPr>
+          <w:p>
+            <w:pPr>
+              <w:spacing w:before="0" w:after="60"/>
+              <w:keepNext/>
+              <w:jc w:val="center"/>
+            </w:pPr>
+            <w:r>
+              <w:rPr>
+                <w:rFonts w:ascii="Calibri" w:hAnsi="Calibri"/>
+                <w:sz w:val="20"/>
+              </w:rPr>
+              <w:t xml:space="default">1,425.97 (1,968.41)</w:t>
+            </w:r>
+          </w:p>
+        </w:tc>
+        <w:tc>
+          <w:tcPr>
+            <w:tcBorders>
+              <w:top w:val="single" w:space="0" w:color="D3D3D3"/>
+              <w:bottom w:val="single" w:space="0" w:color="D3D3D3"/>
+              <w:start w:val="single" w:space="0" w:color="D3D3D3"/>
+              <w:end w:val="single" w:space="0" w:color="D3D3D3"/>
+            </w:tcBorders>
+          </w:tcPr>
+          <w:p>
+            <w:pPr>
+              <w:spacing w:before="0" w:after="60"/>
+              <w:keepNext/>
+              <w:jc w:val="center"/>
+            </w:pPr>
+            <w:r>
+              <w:rPr>
+                <w:rFonts w:ascii="Calibri" w:hAnsi="Calibri"/>
+                <w:sz w:val="20"/>
+              </w:rPr>
+              <w:t xml:space="default">1,530.23 (2,123.67)</w:t>
+            </w:r>
+          </w:p>
+        </w:tc>
+        <w:tc>
+          <w:tcPr>
+            <w:tcBorders>
+              <w:top w:val="single" w:space="0" w:color="D3D3D3"/>
+              <w:bottom w:val="single" w:space="0" w:color="D3D3D3"/>
+              <w:start w:val="single" w:space="0" w:color="D3D3D3"/>
+              <w:end w:val="single" w:space="0" w:color="D3D3D3"/>
+            </w:tcBorders>
+          </w:tcPr>
+          <w:p>
+            <w:pPr>
+              <w:spacing w:before="0" w:after="60"/>
+              <w:keepNext/>
+              <w:jc w:val="center"/>
+            </w:pPr>
+            <w:r>
+              <w:rPr>
+                <w:rFonts w:ascii="Calibri" w:hAnsi="Calibri"/>
+                <w:sz w:val="20"/>
+              </w:rPr>
+              <w:t xml:space="default">1,254.62 (1,598.33)</w:t>
+            </w:r>
+          </w:p>
+        </w:tc>
+        <w:tc>
+          <w:tcPr>
+            <w:tcBorders>
+              <w:top w:val="single" w:space="0" w:color="D3D3D3"/>
+              <w:bottom w:val="single" w:space="0" w:color="D3D3D3"/>
+              <w:start w:val="single" w:space="0" w:color="D3D3D3"/>
+              <w:end w:val="single" w:space="0" w:color="D3D3D3"/>
+            </w:tcBorders>
+          </w:tcPr>
+          <w:p>
+            <w:pPr>
+              <w:spacing w:before="0" w:after="60"/>
+              <w:keepNext/>
+              <w:jc w:val="center"/>
+            </w:pPr>
+            <w:r>
+              <w:rPr>
+                <w:rFonts w:ascii="Calibri" w:hAnsi="Calibri"/>
+                <w:sz w:val="20"/>
+              </w:rPr>
+              <w:t xml:space="default">837.62 (1,125.37)</w:t>
+            </w:r>
+          </w:p>
+        </w:tc>
+        <w:tc>
+          <w:tcPr>
+            <w:tcBorders>
+              <w:top w:val="single" w:space="0" w:color="D3D3D3"/>
+              <w:bottom w:val="single" w:space="0" w:color="D3D3D3"/>
+              <w:start w:val="single" w:space="0" w:color="D3D3D3"/>
+              <w:end w:val="single" w:space="0" w:color="D3D3D3"/>
+            </w:tcBorders>
+          </w:tcPr>
+          <w:p>
+            <w:pPr>
+              <w:spacing w:before="0" w:after="60"/>
+              <w:keepNext/>
+              <w:jc w:val="center"/>
+            </w:pPr>
+            <w:r>
+              <w:rPr>
+                <w:rFonts w:ascii="Calibri" w:hAnsi="Calibri"/>
+                <w:sz w:val="20"/>
+              </w:rPr>
+              <w:t xml:space="default">&lt;0.001</w:t>
             </w:r>
           </w:p>
         </w:tc>
@@ -1133,79 +2468,199 @@
                 <w:sz w:val="20"/>
                 <w:b w:val="true"/>
               </w:rPr>
-              <w:t xml:space="default">Medicaid ADHD spending (2021 USD)</w:t>
-            </w:r>
-          </w:p>
-        </w:tc>
-        <w:tc>
-          <w:tcPr>
-            <w:tcBorders>
-              <w:top w:val="single" w:space="0" w:color="D3D3D3"/>
-              <w:bottom w:val="single" w:space="0" w:color="D3D3D3"/>
-              <w:start w:val="single" w:space="0" w:color="D3D3D3"/>
-              <w:end w:val="single" w:space="0" w:color="D3D3D3"/>
-            </w:tcBorders>
-          </w:tcPr>
-          <w:p>
-            <w:pPr>
-              <w:spacing w:before="0" w:after="60"/>
-              <w:keepNext/>
-              <w:jc w:val="center"/>
-            </w:pPr>
-            <w:r>
-              <w:rPr>
-                <w:rFonts w:ascii="Calibri" w:hAnsi="Calibri"/>
-                <w:sz w:val="20"/>
-              </w:rPr>
-              <w:t xml:space="default">376 (1,246)</w:t>
-            </w:r>
-          </w:p>
-        </w:tc>
-        <w:tc>
-          <w:tcPr>
-            <w:tcBorders>
-              <w:top w:val="single" w:space="0" w:color="D3D3D3"/>
-              <w:bottom w:val="single" w:space="0" w:color="D3D3D3"/>
-              <w:start w:val="single" w:space="0" w:color="D3D3D3"/>
-              <w:end w:val="single" w:space="0" w:color="D3D3D3"/>
-            </w:tcBorders>
-          </w:tcPr>
-          <w:p>
-            <w:pPr>
-              <w:spacing w:before="0" w:after="60"/>
-              <w:keepNext/>
-              <w:jc w:val="center"/>
-            </w:pPr>
-            <w:r>
-              <w:rPr>
-                <w:rFonts w:ascii="Calibri" w:hAnsi="Calibri"/>
-                <w:sz w:val="20"/>
-              </w:rPr>
-              <w:t xml:space="default">531 (2,045)</w:t>
-            </w:r>
-          </w:p>
-        </w:tc>
-        <w:tc>
-          <w:tcPr>
-            <w:tcBorders>
-              <w:top w:val="single" w:space="0" w:color="D3D3D3"/>
-              <w:bottom w:val="single" w:space="0" w:color="D3D3D3"/>
-              <w:start w:val="single" w:space="0" w:color="D3D3D3"/>
-              <w:end w:val="single" w:space="0" w:color="D3D3D3"/>
-            </w:tcBorders>
-          </w:tcPr>
-          <w:p>
-            <w:pPr>
-              <w:spacing w:before="0" w:after="60"/>
-              <w:keepNext/>
-              <w:jc w:val="center"/>
-            </w:pPr>
-            <w:r>
-              <w:rPr>
-                <w:rFonts w:ascii="Calibri" w:hAnsi="Calibri"/>
-                <w:sz w:val="20"/>
-              </w:rPr>
-              <w:t xml:space="default">0.2</w:t>
+              <w:t xml:space="default">Expenditure by private insurance (2023 USD)</w:t>
+            </w:r>
+          </w:p>
+        </w:tc>
+        <w:tc>
+          <w:tcPr>
+            <w:tcBorders>
+              <w:top w:val="single" w:space="0" w:color="D3D3D3"/>
+              <w:bottom w:val="single" w:space="0" w:color="D3D3D3"/>
+              <w:start w:val="single" w:space="0" w:color="D3D3D3"/>
+              <w:end w:val="single" w:space="0" w:color="D3D3D3"/>
+            </w:tcBorders>
+          </w:tcPr>
+          <w:p>
+            <w:pPr>
+              <w:spacing w:before="0" w:after="60"/>
+              <w:keepNext/>
+              <w:jc w:val="center"/>
+            </w:pPr>
+            <w:r>
+              <w:rPr>
+                <w:rFonts w:ascii="Calibri" w:hAnsi="Calibri"/>
+                <w:sz w:val="20"/>
+              </w:rPr>
+              <w:t xml:space="default">713.23 (1,342.28)</w:t>
+            </w:r>
+          </w:p>
+        </w:tc>
+        <w:tc>
+          <w:tcPr>
+            <w:tcBorders>
+              <w:top w:val="single" w:space="0" w:color="D3D3D3"/>
+              <w:bottom w:val="single" w:space="0" w:color="D3D3D3"/>
+              <w:start w:val="single" w:space="0" w:color="D3D3D3"/>
+              <w:end w:val="single" w:space="0" w:color="D3D3D3"/>
+            </w:tcBorders>
+          </w:tcPr>
+          <w:p>
+            <w:pPr>
+              <w:spacing w:before="0" w:after="60"/>
+              <w:keepNext/>
+              <w:jc w:val="center"/>
+            </w:pPr>
+            <w:r>
+              <w:rPr>
+                <w:rFonts w:ascii="Calibri" w:hAnsi="Calibri"/>
+                <w:sz w:val="20"/>
+              </w:rPr>
+              <w:t xml:space="default">921.32 (1,624.60)</w:t>
+            </w:r>
+          </w:p>
+        </w:tc>
+        <w:tc>
+          <w:tcPr>
+            <w:tcBorders>
+              <w:top w:val="single" w:space="0" w:color="D3D3D3"/>
+              <w:bottom w:val="single" w:space="0" w:color="D3D3D3"/>
+              <w:start w:val="single" w:space="0" w:color="D3D3D3"/>
+              <w:end w:val="single" w:space="0" w:color="D3D3D3"/>
+            </w:tcBorders>
+          </w:tcPr>
+          <w:p>
+            <w:pPr>
+              <w:spacing w:before="0" w:after="60"/>
+              <w:keepNext/>
+              <w:jc w:val="center"/>
+            </w:pPr>
+            <w:r>
+              <w:rPr>
+                <w:rFonts w:ascii="Calibri" w:hAnsi="Calibri"/>
+                <w:sz w:val="20"/>
+              </w:rPr>
+              <w:t xml:space="default">857.12 (1,486.67)</w:t>
+            </w:r>
+          </w:p>
+        </w:tc>
+        <w:tc>
+          <w:tcPr>
+            <w:tcBorders>
+              <w:top w:val="single" w:space="0" w:color="D3D3D3"/>
+              <w:bottom w:val="single" w:space="0" w:color="D3D3D3"/>
+              <w:start w:val="single" w:space="0" w:color="D3D3D3"/>
+              <w:end w:val="single" w:space="0" w:color="D3D3D3"/>
+            </w:tcBorders>
+          </w:tcPr>
+          <w:p>
+            <w:pPr>
+              <w:spacing w:before="0" w:after="60"/>
+              <w:keepNext/>
+              <w:jc w:val="center"/>
+            </w:pPr>
+            <w:r>
+              <w:rPr>
+                <w:rFonts w:ascii="Calibri" w:hAnsi="Calibri"/>
+                <w:sz w:val="20"/>
+              </w:rPr>
+              <w:t xml:space="default">677.79 (1,499.38)</w:t>
+            </w:r>
+          </w:p>
+        </w:tc>
+        <w:tc>
+          <w:tcPr>
+            <w:tcBorders>
+              <w:top w:val="single" w:space="0" w:color="D3D3D3"/>
+              <w:bottom w:val="single" w:space="0" w:color="D3D3D3"/>
+              <w:start w:val="single" w:space="0" w:color="D3D3D3"/>
+              <w:end w:val="single" w:space="0" w:color="D3D3D3"/>
+            </w:tcBorders>
+          </w:tcPr>
+          <w:p>
+            <w:pPr>
+              <w:spacing w:before="0" w:after="60"/>
+              <w:keepNext/>
+              <w:jc w:val="center"/>
+            </w:pPr>
+            <w:r>
+              <w:rPr>
+                <w:rFonts w:ascii="Calibri" w:hAnsi="Calibri"/>
+                <w:sz w:val="20"/>
+              </w:rPr>
+              <w:t xml:space="default">661.61 (1,294.66)</w:t>
+            </w:r>
+          </w:p>
+        </w:tc>
+        <w:tc>
+          <w:tcPr>
+            <w:tcBorders>
+              <w:top w:val="single" w:space="0" w:color="D3D3D3"/>
+              <w:bottom w:val="single" w:space="0" w:color="D3D3D3"/>
+              <w:start w:val="single" w:space="0" w:color="D3D3D3"/>
+              <w:end w:val="single" w:space="0" w:color="D3D3D3"/>
+            </w:tcBorders>
+          </w:tcPr>
+          <w:p>
+            <w:pPr>
+              <w:spacing w:before="0" w:after="60"/>
+              <w:keepNext/>
+              <w:jc w:val="center"/>
+            </w:pPr>
+            <w:r>
+              <w:rPr>
+                <w:rFonts w:ascii="Calibri" w:hAnsi="Calibri"/>
+                <w:sz w:val="20"/>
+              </w:rPr>
+              <w:t xml:space="default">687.67 (1,258.13)</w:t>
+            </w:r>
+          </w:p>
+        </w:tc>
+        <w:tc>
+          <w:tcPr>
+            <w:tcBorders>
+              <w:top w:val="single" w:space="0" w:color="D3D3D3"/>
+              <w:bottom w:val="single" w:space="0" w:color="D3D3D3"/>
+              <w:start w:val="single" w:space="0" w:color="D3D3D3"/>
+              <w:end w:val="single" w:space="0" w:color="D3D3D3"/>
+            </w:tcBorders>
+          </w:tcPr>
+          <w:p>
+            <w:pPr>
+              <w:spacing w:before="0" w:after="60"/>
+              <w:keepNext/>
+              <w:jc w:val="center"/>
+            </w:pPr>
+            <w:r>
+              <w:rPr>
+                <w:rFonts w:ascii="Calibri" w:hAnsi="Calibri"/>
+                <w:sz w:val="20"/>
+              </w:rPr>
+              <w:t xml:space="default">382.64 (803.23)</w:t>
+            </w:r>
+          </w:p>
+        </w:tc>
+        <w:tc>
+          <w:tcPr>
+            <w:tcBorders>
+              <w:top w:val="single" w:space="0" w:color="D3D3D3"/>
+              <w:bottom w:val="single" w:space="0" w:color="D3D3D3"/>
+              <w:start w:val="single" w:space="0" w:color="D3D3D3"/>
+              <w:end w:val="single" w:space="0" w:color="D3D3D3"/>
+            </w:tcBorders>
+          </w:tcPr>
+          <w:p>
+            <w:pPr>
+              <w:spacing w:before="0" w:after="60"/>
+              <w:keepNext/>
+              <w:jc w:val="center"/>
+            </w:pPr>
+            <w:r>
+              <w:rPr>
+                <w:rFonts w:ascii="Calibri" w:hAnsi="Calibri"/>
+                <w:sz w:val="20"/>
+              </w:rPr>
+              <w:t xml:space="default">0.015</w:t>
             </w:r>
           </w:p>
         </w:tc>
@@ -1235,55 +2690,175 @@
                 <w:sz w:val="20"/>
                 <w:b w:val="true"/>
               </w:rPr>
-              <w:t xml:space="default">Out-of-pocket share of ADHD medication spending (%)</w:t>
-            </w:r>
-          </w:p>
-        </w:tc>
-        <w:tc>
-          <w:tcPr>
-            <w:tcBorders>
-              <w:top w:val="single" w:space="0" w:color="D3D3D3"/>
-              <w:bottom w:val="single" w:space="0" w:color="D3D3D3"/>
-              <w:start w:val="single" w:space="0" w:color="D3D3D3"/>
-              <w:end w:val="single" w:space="0" w:color="D3D3D3"/>
-            </w:tcBorders>
-          </w:tcPr>
-          <w:p>
-            <w:pPr>
-              <w:spacing w:before="0" w:after="60"/>
-              <w:keepNext/>
-              <w:jc w:val="center"/>
-            </w:pPr>
-            <w:r>
-              <w:rPr>
-                <w:rFonts w:ascii="Calibri" w:hAnsi="Calibri"/>
-                <w:sz w:val="20"/>
-              </w:rPr>
-              <w:t xml:space="default">36 (42)</w:t>
-            </w:r>
-          </w:p>
-        </w:tc>
-        <w:tc>
-          <w:tcPr>
-            <w:tcBorders>
-              <w:top w:val="single" w:space="0" w:color="D3D3D3"/>
-              <w:bottom w:val="single" w:space="0" w:color="D3D3D3"/>
-              <w:start w:val="single" w:space="0" w:color="D3D3D3"/>
-              <w:end w:val="single" w:space="0" w:color="D3D3D3"/>
-            </w:tcBorders>
-          </w:tcPr>
-          <w:p>
-            <w:pPr>
-              <w:spacing w:before="0" w:after="60"/>
-              <w:keepNext/>
-              <w:jc w:val="center"/>
-            </w:pPr>
-            <w:r>
-              <w:rPr>
-                <w:rFonts w:ascii="Calibri" w:hAnsi="Calibri"/>
-                <w:sz w:val="20"/>
-              </w:rPr>
-              <w:t xml:space="default">42 (43)</w:t>
+              <w:t xml:space="default">Expenditure by Medicaid (2023 USD)</w:t>
+            </w:r>
+          </w:p>
+        </w:tc>
+        <w:tc>
+          <w:tcPr>
+            <w:tcBorders>
+              <w:top w:val="single" w:space="0" w:color="D3D3D3"/>
+              <w:bottom w:val="single" w:space="0" w:color="D3D3D3"/>
+              <w:start w:val="single" w:space="0" w:color="D3D3D3"/>
+              <w:end w:val="single" w:space="0" w:color="D3D3D3"/>
+            </w:tcBorders>
+          </w:tcPr>
+          <w:p>
+            <w:pPr>
+              <w:spacing w:before="0" w:after="60"/>
+              <w:keepNext/>
+              <w:jc w:val="center"/>
+            </w:pPr>
+            <w:r>
+              <w:rPr>
+                <w:rFonts w:ascii="Calibri" w:hAnsi="Calibri"/>
+                <w:sz w:val="20"/>
+              </w:rPr>
+              <w:t xml:space="default">539.22 (1,143.19)</w:t>
+            </w:r>
+          </w:p>
+        </w:tc>
+        <w:tc>
+          <w:tcPr>
+            <w:tcBorders>
+              <w:top w:val="single" w:space="0" w:color="D3D3D3"/>
+              <w:bottom w:val="single" w:space="0" w:color="D3D3D3"/>
+              <w:start w:val="single" w:space="0" w:color="D3D3D3"/>
+              <w:end w:val="single" w:space="0" w:color="D3D3D3"/>
+            </w:tcBorders>
+          </w:tcPr>
+          <w:p>
+            <w:pPr>
+              <w:spacing w:before="0" w:after="60"/>
+              <w:keepNext/>
+              <w:jc w:val="center"/>
+            </w:pPr>
+            <w:r>
+              <w:rPr>
+                <w:rFonts w:ascii="Calibri" w:hAnsi="Calibri"/>
+                <w:sz w:val="20"/>
+              </w:rPr>
+              <w:t xml:space="default">623.43 (1,453.58)</w:t>
+            </w:r>
+          </w:p>
+        </w:tc>
+        <w:tc>
+          <w:tcPr>
+            <w:tcBorders>
+              <w:top w:val="single" w:space="0" w:color="D3D3D3"/>
+              <w:bottom w:val="single" w:space="0" w:color="D3D3D3"/>
+              <w:start w:val="single" w:space="0" w:color="D3D3D3"/>
+              <w:end w:val="single" w:space="0" w:color="D3D3D3"/>
+            </w:tcBorders>
+          </w:tcPr>
+          <w:p>
+            <w:pPr>
+              <w:spacing w:before="0" w:after="60"/>
+              <w:keepNext/>
+              <w:jc w:val="center"/>
+            </w:pPr>
+            <w:r>
+              <w:rPr>
+                <w:rFonts w:ascii="Calibri" w:hAnsi="Calibri"/>
+                <w:sz w:val="20"/>
+              </w:rPr>
+              <w:t xml:space="default">632.10 (1,681.55)</w:t>
+            </w:r>
+          </w:p>
+        </w:tc>
+        <w:tc>
+          <w:tcPr>
+            <w:tcBorders>
+              <w:top w:val="single" w:space="0" w:color="D3D3D3"/>
+              <w:bottom w:val="single" w:space="0" w:color="D3D3D3"/>
+              <w:start w:val="single" w:space="0" w:color="D3D3D3"/>
+              <w:end w:val="single" w:space="0" w:color="D3D3D3"/>
+            </w:tcBorders>
+          </w:tcPr>
+          <w:p>
+            <w:pPr>
+              <w:spacing w:before="0" w:after="60"/>
+              <w:keepNext/>
+              <w:jc w:val="center"/>
+            </w:pPr>
+            <w:r>
+              <w:rPr>
+                <w:rFonts w:ascii="Calibri" w:hAnsi="Calibri"/>
+                <w:sz w:val="20"/>
+              </w:rPr>
+              <w:t xml:space="default">504.06 (1,286.56)</w:t>
+            </w:r>
+          </w:p>
+        </w:tc>
+        <w:tc>
+          <w:tcPr>
+            <w:tcBorders>
+              <w:top w:val="single" w:space="0" w:color="D3D3D3"/>
+              <w:bottom w:val="single" w:space="0" w:color="D3D3D3"/>
+              <w:start w:val="single" w:space="0" w:color="D3D3D3"/>
+              <w:end w:val="single" w:space="0" w:color="D3D3D3"/>
+            </w:tcBorders>
+          </w:tcPr>
+          <w:p>
+            <w:pPr>
+              <w:spacing w:before="0" w:after="60"/>
+              <w:keepNext/>
+              <w:jc w:val="center"/>
+            </w:pPr>
+            <w:r>
+              <w:rPr>
+                <w:rFonts w:ascii="Calibri" w:hAnsi="Calibri"/>
+                <w:sz w:val="20"/>
+              </w:rPr>
+              <w:t xml:space="default">549.11 (1,774.50)</w:t>
+            </w:r>
+          </w:p>
+        </w:tc>
+        <w:tc>
+          <w:tcPr>
+            <w:tcBorders>
+              <w:top w:val="single" w:space="0" w:color="D3D3D3"/>
+              <w:bottom w:val="single" w:space="0" w:color="D3D3D3"/>
+              <w:start w:val="single" w:space="0" w:color="D3D3D3"/>
+              <w:end w:val="single" w:space="0" w:color="D3D3D3"/>
+            </w:tcBorders>
+          </w:tcPr>
+          <w:p>
+            <w:pPr>
+              <w:spacing w:before="0" w:after="60"/>
+              <w:keepNext/>
+              <w:jc w:val="center"/>
+            </w:pPr>
+            <w:r>
+              <w:rPr>
+                <w:rFonts w:ascii="Calibri" w:hAnsi="Calibri"/>
+                <w:sz w:val="20"/>
+              </w:rPr>
+              <w:t xml:space="default">341.93 (994.38)</w:t>
+            </w:r>
+          </w:p>
+        </w:tc>
+        <w:tc>
+          <w:tcPr>
+            <w:tcBorders>
+              <w:top w:val="single" w:space="0" w:color="D3D3D3"/>
+              <w:bottom w:val="single" w:space="0" w:color="D3D3D3"/>
+              <w:start w:val="single" w:space="0" w:color="D3D3D3"/>
+              <w:end w:val="single" w:space="0" w:color="D3D3D3"/>
+            </w:tcBorders>
+          </w:tcPr>
+          <w:p>
+            <w:pPr>
+              <w:spacing w:before="0" w:after="60"/>
+              <w:keepNext/>
+              <w:jc w:val="center"/>
+            </w:pPr>
+            <w:r>
+              <w:rPr>
+                <w:rFonts w:ascii="Calibri" w:hAnsi="Calibri"/>
+                <w:sz w:val="20"/>
+              </w:rPr>
+              <w:t xml:space="default">282.61 (816.68)</w:t>
             </w:r>
           </w:p>
         </w:tc>
@@ -1318,28 +2893,218 @@
         </w:trPr>
         <w:tc>
           <w:tcPr>
-            <w:gridSpan w:val="4"/>
-          </w:tcPr>
-          <w:p>
-            <w:pPr>
-              <w:spacing w:before="0" w:after="60"/>
-              <w:keepNext/>
-            </w:pPr>
-            <w:r>
-              <w:rPr>
-                <w:vertAlign w:val="superscript"/>
-                <w:i/>
-                <w:rFonts w:ascii="Calibri" w:hAnsi="Calibri"/>
-                <w:sz w:val="20"/>
-              </w:rPr>
-              <w:t xml:space="default">1</w:t>
-            </w:r>
-            <w:r>
-              <w:rPr>
-                <w:rFonts w:ascii="Calibri" w:hAnsi="Calibri"/>
-                <w:sz w:val="20"/>
-              </w:rPr>
-              <w:t xml:space="preserve">Participants who were on different formulations of the same drug (e.g., normal and extended-release) are characterized as using 2 unique ADHD drugs.</w:t>
+            <w:tcBorders>
+              <w:top w:val="single" w:space="0" w:color="D3D3D3"/>
+              <w:bottom w:val="single" w:space="0" w:color="D3D3D3"/>
+              <w:start w:val="single" w:space="0" w:color="D3D3D3"/>
+              <w:end w:val="single" w:space="0" w:color="D3D3D3"/>
+            </w:tcBorders>
+          </w:tcPr>
+          <w:p>
+            <w:pPr>
+              <w:spacing w:before="0" w:after="60"/>
+              <w:keepNext/>
+              <w:jc w:val="start"/>
+            </w:pPr>
+            <w:r>
+              <w:rPr>
+                <w:rFonts w:ascii="Calibri" w:hAnsi="Calibri"/>
+                <w:sz w:val="20"/>
+                <w:b w:val="true"/>
+              </w:rPr>
+              <w:t xml:space="default">Out-of-pocket expenditure (2023 USD)</w:t>
+            </w:r>
+          </w:p>
+        </w:tc>
+        <w:tc>
+          <w:tcPr>
+            <w:tcBorders>
+              <w:top w:val="single" w:space="0" w:color="D3D3D3"/>
+              <w:bottom w:val="single" w:space="0" w:color="D3D3D3"/>
+              <w:start w:val="single" w:space="0" w:color="D3D3D3"/>
+              <w:end w:val="single" w:space="0" w:color="D3D3D3"/>
+            </w:tcBorders>
+          </w:tcPr>
+          <w:p>
+            <w:pPr>
+              <w:spacing w:before="0" w:after="60"/>
+              <w:keepNext/>
+              <w:jc w:val="center"/>
+            </w:pPr>
+            <w:r>
+              <w:rPr>
+                <w:rFonts w:ascii="Calibri" w:hAnsi="Calibri"/>
+                <w:sz w:val="20"/>
+              </w:rPr>
+              <w:t xml:space="default">216.93 (697.42)</w:t>
+            </w:r>
+          </w:p>
+        </w:tc>
+        <w:tc>
+          <w:tcPr>
+            <w:tcBorders>
+              <w:top w:val="single" w:space="0" w:color="D3D3D3"/>
+              <w:bottom w:val="single" w:space="0" w:color="D3D3D3"/>
+              <w:start w:val="single" w:space="0" w:color="D3D3D3"/>
+              <w:end w:val="single" w:space="0" w:color="D3D3D3"/>
+            </w:tcBorders>
+          </w:tcPr>
+          <w:p>
+            <w:pPr>
+              <w:spacing w:before="0" w:after="60"/>
+              <w:keepNext/>
+              <w:jc w:val="center"/>
+            </w:pPr>
+            <w:r>
+              <w:rPr>
+                <w:rFonts w:ascii="Calibri" w:hAnsi="Calibri"/>
+                <w:sz w:val="20"/>
+              </w:rPr>
+              <w:t xml:space="default">236.82 (490.76)</w:t>
+            </w:r>
+          </w:p>
+        </w:tc>
+        <w:tc>
+          <w:tcPr>
+            <w:tcBorders>
+              <w:top w:val="single" w:space="0" w:color="D3D3D3"/>
+              <w:bottom w:val="single" w:space="0" w:color="D3D3D3"/>
+              <w:start w:val="single" w:space="0" w:color="D3D3D3"/>
+              <w:end w:val="single" w:space="0" w:color="D3D3D3"/>
+            </w:tcBorders>
+          </w:tcPr>
+          <w:p>
+            <w:pPr>
+              <w:spacing w:before="0" w:after="60"/>
+              <w:keepNext/>
+              <w:jc w:val="center"/>
+            </w:pPr>
+            <w:r>
+              <w:rPr>
+                <w:rFonts w:ascii="Calibri" w:hAnsi="Calibri"/>
+                <w:sz w:val="20"/>
+              </w:rPr>
+              <w:t xml:space="default">214.05 (425.93)</w:t>
+            </w:r>
+          </w:p>
+        </w:tc>
+        <w:tc>
+          <w:tcPr>
+            <w:tcBorders>
+              <w:top w:val="single" w:space="0" w:color="D3D3D3"/>
+              <w:bottom w:val="single" w:space="0" w:color="D3D3D3"/>
+              <w:start w:val="single" w:space="0" w:color="D3D3D3"/>
+              <w:end w:val="single" w:space="0" w:color="D3D3D3"/>
+            </w:tcBorders>
+          </w:tcPr>
+          <w:p>
+            <w:pPr>
+              <w:spacing w:before="0" w:after="60"/>
+              <w:keepNext/>
+              <w:jc w:val="center"/>
+            </w:pPr>
+            <w:r>
+              <w:rPr>
+                <w:rFonts w:ascii="Calibri" w:hAnsi="Calibri"/>
+                <w:sz w:val="20"/>
+              </w:rPr>
+              <w:t xml:space="default">187.19 (388.53)</w:t>
+            </w:r>
+          </w:p>
+        </w:tc>
+        <w:tc>
+          <w:tcPr>
+            <w:tcBorders>
+              <w:top w:val="single" w:space="0" w:color="D3D3D3"/>
+              <w:bottom w:val="single" w:space="0" w:color="D3D3D3"/>
+              <w:start w:val="single" w:space="0" w:color="D3D3D3"/>
+              <w:end w:val="single" w:space="0" w:color="D3D3D3"/>
+            </w:tcBorders>
+          </w:tcPr>
+          <w:p>
+            <w:pPr>
+              <w:spacing w:before="0" w:after="60"/>
+              <w:keepNext/>
+              <w:jc w:val="center"/>
+            </w:pPr>
+            <w:r>
+              <w:rPr>
+                <w:rFonts w:ascii="Calibri" w:hAnsi="Calibri"/>
+                <w:sz w:val="20"/>
+              </w:rPr>
+              <w:t xml:space="default">242.41 (450.24)</w:t>
+            </w:r>
+          </w:p>
+        </w:tc>
+        <w:tc>
+          <w:tcPr>
+            <w:tcBorders>
+              <w:top w:val="single" w:space="0" w:color="D3D3D3"/>
+              <w:bottom w:val="single" w:space="0" w:color="D3D3D3"/>
+              <w:start w:val="single" w:space="0" w:color="D3D3D3"/>
+              <w:end w:val="single" w:space="0" w:color="D3D3D3"/>
+            </w:tcBorders>
+          </w:tcPr>
+          <w:p>
+            <w:pPr>
+              <w:spacing w:before="0" w:after="60"/>
+              <w:keepNext/>
+              <w:jc w:val="center"/>
+            </w:pPr>
+            <w:r>
+              <w:rPr>
+                <w:rFonts w:ascii="Calibri" w:hAnsi="Calibri"/>
+                <w:sz w:val="20"/>
+              </w:rPr>
+              <w:t xml:space="default">158.29 (257.01)</w:t>
+            </w:r>
+          </w:p>
+        </w:tc>
+        <w:tc>
+          <w:tcPr>
+            <w:tcBorders>
+              <w:top w:val="single" w:space="0" w:color="D3D3D3"/>
+              <w:bottom w:val="single" w:space="0" w:color="D3D3D3"/>
+              <w:start w:val="single" w:space="0" w:color="D3D3D3"/>
+              <w:end w:val="single" w:space="0" w:color="D3D3D3"/>
+            </w:tcBorders>
+          </w:tcPr>
+          <w:p>
+            <w:pPr>
+              <w:spacing w:before="0" w:after="60"/>
+              <w:keepNext/>
+              <w:jc w:val="center"/>
+            </w:pPr>
+            <w:r>
+              <w:rPr>
+                <w:rFonts w:ascii="Calibri" w:hAnsi="Calibri"/>
+                <w:sz w:val="20"/>
+              </w:rPr>
+              <w:t xml:space="default">143.39 (343.70)</w:t>
+            </w:r>
+          </w:p>
+        </w:tc>
+        <w:tc>
+          <w:tcPr>
+            <w:tcBorders>
+              <w:top w:val="single" w:space="0" w:color="D3D3D3"/>
+              <w:bottom w:val="single" w:space="0" w:color="D3D3D3"/>
+              <w:start w:val="single" w:space="0" w:color="D3D3D3"/>
+              <w:end w:val="single" w:space="0" w:color="D3D3D3"/>
+            </w:tcBorders>
+          </w:tcPr>
+          <w:p>
+            <w:pPr>
+              <w:spacing w:before="0" w:after="60"/>
+              <w:keepNext/>
+              <w:jc w:val="center"/>
+            </w:pPr>
+            <w:r>
+              <w:rPr>
+                <w:rFonts w:ascii="Calibri" w:hAnsi="Calibri"/>
+                <w:sz w:val="20"/>
+              </w:rPr>
+              <w:t xml:space="default">0.12</w:t>
             </w:r>
           </w:p>
         </w:tc>
@@ -1350,28 +3115,218 @@
         </w:trPr>
         <w:tc>
           <w:tcPr>
-            <w:gridSpan w:val="4"/>
-          </w:tcPr>
-          <w:p>
-            <w:pPr>
-              <w:spacing w:before="0" w:after="60"/>
-              <w:keepNext/>
-            </w:pPr>
-            <w:r>
-              <w:rPr>
-                <w:vertAlign w:val="superscript"/>
-                <w:i/>
-                <w:rFonts w:ascii="Calibri" w:hAnsi="Calibri"/>
-                <w:sz w:val="20"/>
-              </w:rPr>
-              <w:t xml:space="default">2</w:t>
-            </w:r>
-            <w:r>
-              <w:rPr>
-                <w:rFonts w:ascii="Calibri" w:hAnsi="Calibri"/>
-                <w:sz w:val="20"/>
-              </w:rPr>
-              <w:t xml:space="preserve">n (%); Mean (SD)</w:t>
+            <w:tcBorders>
+              <w:top w:val="single" w:space="0" w:color="D3D3D3"/>
+              <w:bottom w:val="single" w:space="0" w:color="D3D3D3"/>
+              <w:start w:val="single" w:space="0" w:color="D3D3D3"/>
+              <w:end w:val="single" w:space="0" w:color="D3D3D3"/>
+            </w:tcBorders>
+          </w:tcPr>
+          <w:p>
+            <w:pPr>
+              <w:spacing w:before="0" w:after="60"/>
+              <w:keepNext/>
+              <w:jc w:val="start"/>
+            </w:pPr>
+            <w:r>
+              <w:rPr>
+                <w:rFonts w:ascii="Calibri" w:hAnsi="Calibri"/>
+                <w:sz w:val="20"/>
+                <w:b w:val="true"/>
+              </w:rPr>
+              <w:t xml:space="default">Out-of-pocket share of total expenditure (%)</w:t>
+            </w:r>
+          </w:p>
+        </w:tc>
+        <w:tc>
+          <w:tcPr>
+            <w:tcBorders>
+              <w:top w:val="single" w:space="0" w:color="D3D3D3"/>
+              <w:bottom w:val="single" w:space="0" w:color="D3D3D3"/>
+              <w:start w:val="single" w:space="0" w:color="D3D3D3"/>
+              <w:end w:val="single" w:space="0" w:color="D3D3D3"/>
+            </w:tcBorders>
+          </w:tcPr>
+          <w:p>
+            <w:pPr>
+              <w:spacing w:before="0" w:after="60"/>
+              <w:keepNext/>
+              <w:jc w:val="center"/>
+            </w:pPr>
+            <w:r>
+              <w:rPr>
+                <w:rFonts w:ascii="Calibri" w:hAnsi="Calibri"/>
+                <w:sz w:val="20"/>
+              </w:rPr>
+              <w:t xml:space="default">21.26 (31.97)</w:t>
+            </w:r>
+          </w:p>
+        </w:tc>
+        <w:tc>
+          <w:tcPr>
+            <w:tcBorders>
+              <w:top w:val="single" w:space="0" w:color="D3D3D3"/>
+              <w:bottom w:val="single" w:space="0" w:color="D3D3D3"/>
+              <w:start w:val="single" w:space="0" w:color="D3D3D3"/>
+              <w:end w:val="single" w:space="0" w:color="D3D3D3"/>
+            </w:tcBorders>
+          </w:tcPr>
+          <w:p>
+            <w:pPr>
+              <w:spacing w:before="0" w:after="60"/>
+              <w:keepNext/>
+              <w:jc w:val="center"/>
+            </w:pPr>
+            <w:r>
+              <w:rPr>
+                <w:rFonts w:ascii="Calibri" w:hAnsi="Calibri"/>
+                <w:sz w:val="20"/>
+              </w:rPr>
+              <w:t xml:space="default">25.03 (35.87)</w:t>
+            </w:r>
+          </w:p>
+        </w:tc>
+        <w:tc>
+          <w:tcPr>
+            <w:tcBorders>
+              <w:top w:val="single" w:space="0" w:color="D3D3D3"/>
+              <w:bottom w:val="single" w:space="0" w:color="D3D3D3"/>
+              <w:start w:val="single" w:space="0" w:color="D3D3D3"/>
+              <w:end w:val="single" w:space="0" w:color="D3D3D3"/>
+            </w:tcBorders>
+          </w:tcPr>
+          <w:p>
+            <w:pPr>
+              <w:spacing w:before="0" w:after="60"/>
+              <w:keepNext/>
+              <w:jc w:val="center"/>
+            </w:pPr>
+            <w:r>
+              <w:rPr>
+                <w:rFonts w:ascii="Calibri" w:hAnsi="Calibri"/>
+                <w:sz w:val="20"/>
+              </w:rPr>
+              <w:t xml:space="default">22.87 (33.20)</w:t>
+            </w:r>
+          </w:p>
+        </w:tc>
+        <w:tc>
+          <w:tcPr>
+            <w:tcBorders>
+              <w:top w:val="single" w:space="0" w:color="D3D3D3"/>
+              <w:bottom w:val="single" w:space="0" w:color="D3D3D3"/>
+              <w:start w:val="single" w:space="0" w:color="D3D3D3"/>
+              <w:end w:val="single" w:space="0" w:color="D3D3D3"/>
+            </w:tcBorders>
+          </w:tcPr>
+          <w:p>
+            <w:pPr>
+              <w:spacing w:before="0" w:after="60"/>
+              <w:keepNext/>
+              <w:jc w:val="center"/>
+            </w:pPr>
+            <w:r>
+              <w:rPr>
+                <w:rFonts w:ascii="Calibri" w:hAnsi="Calibri"/>
+                <w:sz w:val="20"/>
+              </w:rPr>
+              <w:t xml:space="default">28.71 (35.33)</w:t>
+            </w:r>
+          </w:p>
+        </w:tc>
+        <w:tc>
+          <w:tcPr>
+            <w:tcBorders>
+              <w:top w:val="single" w:space="0" w:color="D3D3D3"/>
+              <w:bottom w:val="single" w:space="0" w:color="D3D3D3"/>
+              <w:start w:val="single" w:space="0" w:color="D3D3D3"/>
+              <w:end w:val="single" w:space="0" w:color="D3D3D3"/>
+            </w:tcBorders>
+          </w:tcPr>
+          <w:p>
+            <w:pPr>
+              <w:spacing w:before="0" w:after="60"/>
+              <w:keepNext/>
+              <w:jc w:val="center"/>
+            </w:pPr>
+            <w:r>
+              <w:rPr>
+                <w:rFonts w:ascii="Calibri" w:hAnsi="Calibri"/>
+                <w:sz w:val="20"/>
+              </w:rPr>
+              <w:t xml:space="default">34.93 (40.63)</w:t>
+            </w:r>
+          </w:p>
+        </w:tc>
+        <w:tc>
+          <w:tcPr>
+            <w:tcBorders>
+              <w:top w:val="single" w:space="0" w:color="D3D3D3"/>
+              <w:bottom w:val="single" w:space="0" w:color="D3D3D3"/>
+              <w:start w:val="single" w:space="0" w:color="D3D3D3"/>
+              <w:end w:val="single" w:space="0" w:color="D3D3D3"/>
+            </w:tcBorders>
+          </w:tcPr>
+          <w:p>
+            <w:pPr>
+              <w:spacing w:before="0" w:after="60"/>
+              <w:keepNext/>
+              <w:jc w:val="center"/>
+            </w:pPr>
+            <w:r>
+              <w:rPr>
+                <w:rFonts w:ascii="Calibri" w:hAnsi="Calibri"/>
+                <w:sz w:val="20"/>
+              </w:rPr>
+              <w:t xml:space="default">30.43 (37.29)</w:t>
+            </w:r>
+          </w:p>
+        </w:tc>
+        <w:tc>
+          <w:tcPr>
+            <w:tcBorders>
+              <w:top w:val="single" w:space="0" w:color="D3D3D3"/>
+              <w:bottom w:val="single" w:space="0" w:color="D3D3D3"/>
+              <w:start w:val="single" w:space="0" w:color="D3D3D3"/>
+              <w:end w:val="single" w:space="0" w:color="D3D3D3"/>
+            </w:tcBorders>
+          </w:tcPr>
+          <w:p>
+            <w:pPr>
+              <w:spacing w:before="0" w:after="60"/>
+              <w:keepNext/>
+              <w:jc w:val="center"/>
+            </w:pPr>
+            <w:r>
+              <w:rPr>
+                <w:rFonts w:ascii="Calibri" w:hAnsi="Calibri"/>
+                <w:sz w:val="20"/>
+              </w:rPr>
+              <w:t xml:space="default">35.08 (40.75)</w:t>
+            </w:r>
+          </w:p>
+        </w:tc>
+        <w:tc>
+          <w:tcPr>
+            <w:tcBorders>
+              <w:top w:val="single" w:space="0" w:color="D3D3D3"/>
+              <w:bottom w:val="single" w:space="0" w:color="D3D3D3"/>
+              <w:start w:val="single" w:space="0" w:color="D3D3D3"/>
+              <w:end w:val="single" w:space="0" w:color="D3D3D3"/>
+            </w:tcBorders>
+          </w:tcPr>
+          <w:p>
+            <w:pPr>
+              <w:spacing w:before="0" w:after="60"/>
+              <w:keepNext/>
+              <w:jc w:val="center"/>
+            </w:pPr>
+            <w:r>
+              <w:rPr>
+                <w:rFonts w:ascii="Calibri" w:hAnsi="Calibri"/>
+                <w:sz w:val="20"/>
+              </w:rPr>
+              <w:t xml:space="default">0.005</w:t>
             </w:r>
           </w:p>
         </w:tc>
@@ -1382,7 +3337,7 @@
         </w:trPr>
         <w:tc>
           <w:tcPr>
-            <w:gridSpan w:val="4"/>
+            <w:gridSpan w:val="9"/>
           </w:tcPr>
           <w:p>
             <w:pPr>
@@ -1396,14 +3351,46 @@
                 <w:rFonts w:ascii="Calibri" w:hAnsi="Calibri"/>
                 <w:sz w:val="20"/>
               </w:rPr>
-              <w:t xml:space="default">3</w:t>
-            </w:r>
-            <w:r>
-              <w:rPr>
-                <w:rFonts w:ascii="Calibri" w:hAnsi="Calibri"/>
-                <w:sz w:val="20"/>
-              </w:rPr>
-              <w:t xml:space="preserve">Pearson's X^2: Rao &amp; Scott adjustment; Design-based KruskalWallis test</w:t>
+              <w:t xml:space="default">1</w:t>
+            </w:r>
+            <w:r>
+              <w:rPr>
+                <w:rFonts w:ascii="Calibri" w:hAnsi="Calibri"/>
+                <w:sz w:val="20"/>
+              </w:rPr>
+              <w:t xml:space="preserve">Mean (SD); n (%)</w:t>
+            </w:r>
+          </w:p>
+        </w:tc>
+      </w:tr>
+      <w:tr>
+        <w:trPr>
+          <w:cantSplit/>
+        </w:trPr>
+        <w:tc>
+          <w:tcPr>
+            <w:gridSpan w:val="9"/>
+          </w:tcPr>
+          <w:p>
+            <w:pPr>
+              <w:spacing w:before="0" w:after="60"/>
+              <w:keepNext/>
+            </w:pPr>
+            <w:r>
+              <w:rPr>
+                <w:vertAlign w:val="superscript"/>
+                <w:i/>
+                <w:rFonts w:ascii="Calibri" w:hAnsi="Calibri"/>
+                <w:sz w:val="20"/>
+              </w:rPr>
+              <w:t xml:space="default">2</w:t>
+            </w:r>
+            <w:r>
+              <w:rPr>
+                <w:rFonts w:ascii="Calibri" w:hAnsi="Calibri"/>
+                <w:sz w:val="20"/>
+              </w:rPr>
+              <w:t xml:space="preserve">Design-based KruskalWallis test; Pearson's X^2: Rao &amp; Scott adjustment</w:t>
             </w:r>
           </w:p>
         </w:tc>

</xml_diff>